<commit_message>
Updated county questions, updated urls
</commit_message>
<xml_diff>
--- a/docassemble/TODI/data/templates/todi_docassemble.docx
+++ b/docassemble/TODI/data/templates/todi_docassemble.docx
@@ -1198,6 +1198,14 @@
       </w:r>
       <w:proofErr w:type="spellStart"/>
       <w:r>
+        <w:t>end_in_county</w:t>
+      </w:r>
+      <w:proofErr w:type="spellEnd"/>
+      <w:r>
+        <w:t>(</w:t>
+      </w:r>
+      <w:proofErr w:type="spellStart"/>
+      <w:r>
         <w:t>todi_</w:t>
       </w:r>
       <w:proofErr w:type="gramStart"/>
@@ -1209,6 +1217,9 @@
       </w:r>
       <w:proofErr w:type="spellEnd"/>
       <w:proofErr w:type="gramEnd"/>
+      <w:r>
+        <w:t>)</w:t>
+      </w:r>
       <w:r>
         <w:t>}}</w:t>
       </w:r>
@@ -7442,6 +7453,14 @@
             </w:r>
             <w:proofErr w:type="spellStart"/>
             <w:r>
+              <w:t>end_in_county</w:t>
+            </w:r>
+            <w:proofErr w:type="spellEnd"/>
+            <w:r>
+              <w:t>(</w:t>
+            </w:r>
+            <w:proofErr w:type="spellStart"/>
+            <w:r>
               <w:t>todi_</w:t>
             </w:r>
             <w:proofErr w:type="gramStart"/>
@@ -7454,7 +7473,7 @@
             <w:proofErr w:type="spellEnd"/>
             <w:proofErr w:type="gramEnd"/>
             <w:r>
-              <w:t xml:space="preserve"> </w:t>
+              <w:t>)</w:t>
             </w:r>
             <w:r>
               <w:t>}}</w:t>

</xml_diff>

<commit_message>
Updated notary block, changed some county info link urls
</commit_message>
<xml_diff>
--- a/docassemble/TODI/data/templates/todi_docassemble.docx
+++ b/docassemble/TODI/data/templates/todi_docassemble.docx
@@ -188,21 +188,8 @@
             <w:r>
               <w:t>{{users[0].</w:t>
             </w:r>
-            <w:proofErr w:type="spellStart"/>
-            <w:r>
-              <w:t>name_</w:t>
-            </w:r>
-            <w:proofErr w:type="gramStart"/>
-            <w:r>
-              <w:t>full</w:t>
-            </w:r>
-            <w:proofErr w:type="spellEnd"/>
-            <w:r>
-              <w:t>(</w:t>
-            </w:r>
-            <w:proofErr w:type="gramEnd"/>
-            <w:r>
-              <w:t>)</w:t>
+            <w:r>
+              <w:t>name_full()</w:t>
             </w:r>
             <w:r>
               <w:t>}}</w:t>
@@ -244,23 +231,7 @@
           </w:tcPr>
           <w:p>
             <w:r>
-              <w:t>{{users[0</w:t>
-            </w:r>
-            <w:proofErr w:type="gramStart"/>
-            <w:r>
-              <w:t>].</w:t>
-            </w:r>
-            <w:proofErr w:type="spellStart"/>
-            <w:r>
-              <w:t>address</w:t>
-            </w:r>
-            <w:proofErr w:type="gramEnd"/>
-            <w:r>
-              <w:t>.line_one</w:t>
-            </w:r>
-            <w:proofErr w:type="spellEnd"/>
-            <w:r>
-              <w:t>(bare=True)}}</w:t>
+              <w:t>{{users[0].address.line_one(bare=True)}}</w:t>
             </w:r>
           </w:p>
         </w:tc>
@@ -297,31 +268,7 @@
           </w:tcPr>
           <w:p>
             <w:r>
-              <w:t>{{users[0</w:t>
-            </w:r>
-            <w:proofErr w:type="gramStart"/>
-            <w:r>
-              <w:t>].</w:t>
-            </w:r>
-            <w:proofErr w:type="spellStart"/>
-            <w:r>
-              <w:t>address</w:t>
-            </w:r>
-            <w:proofErr w:type="gramEnd"/>
-            <w:r>
-              <w:t>.line_</w:t>
-            </w:r>
-            <w:proofErr w:type="gramStart"/>
-            <w:r>
-              <w:t>two</w:t>
-            </w:r>
-            <w:proofErr w:type="spellEnd"/>
-            <w:r>
-              <w:t>(</w:t>
-            </w:r>
-            <w:proofErr w:type="gramEnd"/>
-            <w:r>
-              <w:t>)}}</w:t>
+              <w:t>{{users[0].address.line_two()}}</w:t>
             </w:r>
           </w:p>
         </w:tc>
@@ -405,109 +352,49 @@
               <w:rPr>
                 <w:bCs/>
               </w:rPr>
-              <w:t xml:space="preserve">{% if </w:t>
-            </w:r>
-            <w:proofErr w:type="spellStart"/>
+              <w:t>{% if joint_language == True %}</w:t>
+            </w:r>
             <w:r>
               <w:rPr>
                 <w:bCs/>
               </w:rPr>
-              <w:t>joint_language</w:t>
-            </w:r>
-            <w:proofErr w:type="spellEnd"/>
+              <w:t>{{</w:t>
+            </w:r>
             <w:r>
               <w:rPr>
                 <w:bCs/>
               </w:rPr>
-              <w:t xml:space="preserve"> == True </w:t>
-            </w:r>
-            <w:proofErr w:type="gramStart"/>
+              <w:t>joint_owner</w:t>
+            </w:r>
             <w:r>
               <w:rPr>
                 <w:bCs/>
               </w:rPr>
-              <w:t>%}</w:t>
+              <w:t>.</w:t>
             </w:r>
             <w:r>
               <w:rPr>
                 <w:bCs/>
               </w:rPr>
-              <w:t>{</w:t>
-            </w:r>
-            <w:proofErr w:type="gramEnd"/>
+              <w:t xml:space="preserve"> </w:t>
+            </w:r>
             <w:r>
               <w:rPr>
                 <w:bCs/>
               </w:rPr>
-              <w:t>{</w:t>
-            </w:r>
-            <w:proofErr w:type="spellStart"/>
+              <w:t>name_full()</w:t>
+            </w:r>
             <w:r>
               <w:rPr>
                 <w:bCs/>
               </w:rPr>
-              <w:t>joint_owner</w:t>
-            </w:r>
-            <w:proofErr w:type="spellEnd"/>
+              <w:t>}}</w:t>
+            </w:r>
             <w:r>
               <w:rPr>
                 <w:bCs/>
               </w:rPr>
-              <w:t>.</w:t>
-            </w:r>
-            <w:r>
-              <w:rPr>
-                <w:bCs/>
-              </w:rPr>
-              <w:t xml:space="preserve"> </w:t>
-            </w:r>
-            <w:proofErr w:type="spellStart"/>
-            <w:r>
-              <w:rPr>
-                <w:bCs/>
-              </w:rPr>
-              <w:t>name_</w:t>
-            </w:r>
-            <w:proofErr w:type="gramStart"/>
-            <w:r>
-              <w:rPr>
-                <w:bCs/>
-              </w:rPr>
-              <w:t>full</w:t>
-            </w:r>
-            <w:proofErr w:type="spellEnd"/>
-            <w:r>
-              <w:rPr>
-                <w:bCs/>
-              </w:rPr>
-              <w:t>(</w:t>
-            </w:r>
-            <w:proofErr w:type="gramEnd"/>
-            <w:r>
-              <w:rPr>
-                <w:bCs/>
-              </w:rPr>
-              <w:t>)</w:t>
-            </w:r>
-            <w:proofErr w:type="gramStart"/>
-            <w:r>
-              <w:rPr>
-                <w:bCs/>
-              </w:rPr>
-              <w:t>}}</w:t>
-            </w:r>
-            <w:r>
-              <w:rPr>
-                <w:bCs/>
-              </w:rPr>
-              <w:t>{</w:t>
-            </w:r>
-            <w:proofErr w:type="gramEnd"/>
-            <w:r>
-              <w:rPr>
-                <w:bCs/>
-              </w:rPr>
-              <w:t>% endif %}</w:t>
+              <w:t>{% endif %}</w:t>
             </w:r>
           </w:p>
         </w:tc>
@@ -554,119 +441,61 @@
               <w:rPr>
                 <w:bCs/>
               </w:rPr>
-              <w:t xml:space="preserve">{% if </w:t>
-            </w:r>
-            <w:proofErr w:type="spellStart"/>
+              <w:t>{% if joint_language == True %}</w:t>
+            </w:r>
             <w:r>
               <w:rPr>
                 <w:bCs/>
               </w:rPr>
-              <w:t>joint_language</w:t>
-            </w:r>
-            <w:proofErr w:type="spellEnd"/>
+              <w:t>{{</w:t>
+            </w:r>
             <w:r>
               <w:rPr>
                 <w:bCs/>
               </w:rPr>
-              <w:t xml:space="preserve"> == True </w:t>
-            </w:r>
-            <w:proofErr w:type="gramStart"/>
+              <w:t>joint_owner</w:t>
+            </w:r>
             <w:r>
               <w:rPr>
                 <w:bCs/>
               </w:rPr>
-              <w:t>%}</w:t>
+              <w:t>.</w:t>
             </w:r>
             <w:r>
               <w:rPr>
                 <w:bCs/>
               </w:rPr>
-              <w:t>{</w:t>
-            </w:r>
-            <w:proofErr w:type="gramEnd"/>
+              <w:t>address.line_</w:t>
+            </w:r>
             <w:r>
               <w:rPr>
                 <w:bCs/>
               </w:rPr>
-              <w:t>{</w:t>
-            </w:r>
-            <w:proofErr w:type="spellStart"/>
+              <w:t>one</w:t>
+            </w:r>
             <w:r>
               <w:rPr>
                 <w:bCs/>
               </w:rPr>
-              <w:t>joint_</w:t>
-            </w:r>
-            <w:proofErr w:type="gramStart"/>
+              <w:t>(</w:t>
+            </w:r>
             <w:r>
               <w:rPr>
                 <w:bCs/>
               </w:rPr>
-              <w:t>owner</w:t>
+              <w:t>bare=True</w:t>
             </w:r>
             <w:r>
               <w:rPr>
                 <w:bCs/>
               </w:rPr>
-              <w:t>.</w:t>
+              <w:t>)}}</w:t>
             </w:r>
             <w:r>
               <w:rPr>
                 <w:bCs/>
               </w:rPr>
-              <w:t>address</w:t>
-            </w:r>
-            <w:proofErr w:type="gramEnd"/>
-            <w:r>
-              <w:rPr>
-                <w:bCs/>
-              </w:rPr>
-              <w:t>.line_</w:t>
-            </w:r>
-            <w:r>
-              <w:rPr>
-                <w:bCs/>
-              </w:rPr>
-              <w:t>one</w:t>
-            </w:r>
-            <w:proofErr w:type="spellEnd"/>
-            <w:r>
-              <w:rPr>
-                <w:bCs/>
-              </w:rPr>
-              <w:t>(</w:t>
-            </w:r>
-            <w:r>
-              <w:rPr>
-                <w:bCs/>
-              </w:rPr>
-              <w:t>bare=True</w:t>
-            </w:r>
-            <w:r>
-              <w:rPr>
-                <w:bCs/>
-              </w:rPr>
-              <w:t>)</w:t>
-            </w:r>
-            <w:proofErr w:type="gramStart"/>
-            <w:r>
-              <w:rPr>
-                <w:bCs/>
-              </w:rPr>
-              <w:t>}}</w:t>
-            </w:r>
-            <w:r>
-              <w:rPr>
-                <w:bCs/>
-              </w:rPr>
-              <w:t>{</w:t>
-            </w:r>
-            <w:proofErr w:type="gramEnd"/>
-            <w:r>
-              <w:rPr>
-                <w:bCs/>
-              </w:rPr>
-              <w:t>% endif %}</w:t>
+              <w:t>{% endif %}</w:t>
             </w:r>
           </w:p>
         </w:tc>
@@ -706,73 +535,19 @@
               <w:rPr>
                 <w:bCs/>
               </w:rPr>
-              <w:t xml:space="preserve">{% if </w:t>
-            </w:r>
-            <w:proofErr w:type="spellStart"/>
-            <w:r>
-              <w:rPr>
-                <w:bCs/>
-              </w:rPr>
-              <w:t>joint_language</w:t>
-            </w:r>
-            <w:proofErr w:type="spellEnd"/>
-            <w:r>
-              <w:rPr>
-                <w:bCs/>
-              </w:rPr>
-              <w:t xml:space="preserve"> == True </w:t>
-            </w:r>
-            <w:proofErr w:type="gramStart"/>
-            <w:r>
-              <w:rPr>
-                <w:bCs/>
-              </w:rPr>
-              <w:t>%}</w:t>
-            </w:r>
-            <w:r>
-              <w:t>{</w:t>
-            </w:r>
-            <w:proofErr w:type="gramEnd"/>
-            <w:r>
-              <w:t>{</w:t>
-            </w:r>
-            <w:proofErr w:type="spellStart"/>
-            <w:r>
-              <w:t>joint_</w:t>
-            </w:r>
-            <w:proofErr w:type="gramStart"/>
-            <w:r>
-              <w:t>owner</w:t>
-            </w:r>
-            <w:r>
-              <w:t>.address</w:t>
-            </w:r>
-            <w:proofErr w:type="gramEnd"/>
-            <w:r>
-              <w:t>.line_</w:t>
-            </w:r>
-            <w:proofErr w:type="gramStart"/>
-            <w:r>
-              <w:t>two</w:t>
-            </w:r>
-            <w:proofErr w:type="spellEnd"/>
-            <w:r>
-              <w:t>(</w:t>
-            </w:r>
-            <w:proofErr w:type="gramEnd"/>
-            <w:r>
-              <w:t>)</w:t>
-            </w:r>
-            <w:proofErr w:type="gramStart"/>
-            <w:r>
-              <w:t>}}</w:t>
-            </w:r>
-            <w:r>
-              <w:t>{</w:t>
-            </w:r>
-            <w:proofErr w:type="gramEnd"/>
-            <w:r>
-              <w:t>% endif %}</w:t>
+              <w:t>{% if joint_language == True %}</w:t>
+            </w:r>
+            <w:r>
+              <w:t>{{</w:t>
+            </w:r>
+            <w:r>
+              <w:t>joint_owner</w:t>
+            </w:r>
+            <w:r>
+              <w:t>.address.line_two()}}</w:t>
+            </w:r>
+            <w:r>
+              <w:t>{% endif %}</w:t>
             </w:r>
           </w:p>
         </w:tc>
@@ -866,13 +641,8 @@
       <w:r>
         <w:t xml:space="preserve"> {{users[0].</w:t>
       </w:r>
-      <w:proofErr w:type="spellStart"/>
-      <w:r>
-        <w:t>name_full</w:t>
-      </w:r>
-      <w:proofErr w:type="spellEnd"/>
-      <w:r>
-        <w:t>()</w:t>
+      <w:r>
+        <w:t>name_full()</w:t>
       </w:r>
       <w:r>
         <w:t>}</w:t>
@@ -884,36 +654,11 @@
         <w:t xml:space="preserve"> </w:t>
       </w:r>
       <w:r>
-        <w:t>({{users[0].</w:t>
-      </w:r>
-      <w:proofErr w:type="spellStart"/>
-      <w:r>
-        <w:t>marital_status</w:t>
-      </w:r>
-      <w:proofErr w:type="spellEnd"/>
-      <w:r>
-        <w:t>}}), residing at {{users[0].</w:t>
-      </w:r>
-      <w:proofErr w:type="spellStart"/>
-      <w:r>
-        <w:t>address.on_one_line</w:t>
-      </w:r>
-      <w:proofErr w:type="spellEnd"/>
-      <w:r>
-        <w:t>(bare=True)}},</w:t>
-      </w:r>
-      <w:r>
-        <w:t xml:space="preserve"> {% if </w:t>
-      </w:r>
-      <w:proofErr w:type="spellStart"/>
-      <w:r>
-        <w:t>joint_language</w:t>
-      </w:r>
-      <w:proofErr w:type="spellEnd"/>
-      <w:r>
-        <w:t xml:space="preserve"> == True %}and {{</w:t>
-      </w:r>
-      <w:proofErr w:type="spellStart"/>
+        <w:t>({{users[0].marital_status}}), residing at {{users[0].address.on_one_line(bare=True)}},</w:t>
+      </w:r>
+      <w:r>
+        <w:t xml:space="preserve"> {% if joint_language == True %}and {{</w:t>
+      </w:r>
       <w:r>
         <w:t>joint_owner</w:t>
       </w:r>
@@ -921,11 +666,7 @@
         <w:t>.</w:t>
       </w:r>
       <w:r>
-        <w:t>name_full</w:t>
-      </w:r>
-      <w:proofErr w:type="spellEnd"/>
-      <w:r>
-        <w:t>()</w:t>
+        <w:t>name_full()</w:t>
       </w:r>
       <w:r>
         <w:t>}</w:t>
@@ -936,27 +677,17 @@
       <w:r>
         <w:t>({{</w:t>
       </w:r>
-      <w:proofErr w:type="spellStart"/>
       <w:r>
         <w:t>joint_owner</w:t>
       </w:r>
       <w:r>
-        <w:t>.marital_status</w:t>
-      </w:r>
-      <w:proofErr w:type="spellEnd"/>
-      <w:r>
-        <w:t>}}), residing at {{</w:t>
-      </w:r>
-      <w:proofErr w:type="spellStart"/>
+        <w:t>.marital_status}}), residing at {{</w:t>
+      </w:r>
       <w:r>
         <w:t>joint_owner</w:t>
       </w:r>
       <w:r>
-        <w:t>.address.on_one_line</w:t>
-      </w:r>
-      <w:proofErr w:type="spellEnd"/>
-      <w:r>
-        <w:t>(bare=True)}}</w:t>
+        <w:t>.address.on_one_line(bare=True)}}</w:t>
       </w:r>
       <w:r>
         <w:t xml:space="preserve"> execute {% else %}executes {% endif %}</w:t>
@@ -964,29 +695,15 @@
       <w:r>
         <w:t>this transfer on death instrument. {{users[0].</w:t>
       </w:r>
-      <w:proofErr w:type="spellStart"/>
-      <w:r>
-        <w:t>name_full</w:t>
-      </w:r>
-      <w:proofErr w:type="spellEnd"/>
-      <w:r>
-        <w:t>()</w:t>
+      <w:r>
+        <w:t>name_full()</w:t>
       </w:r>
       <w:r>
         <w:t>}}</w:t>
       </w:r>
       <w:r>
-        <w:t xml:space="preserve"> {% if </w:t>
-      </w:r>
-      <w:proofErr w:type="spellStart"/>
-      <w:r>
-        <w:t>joint_language</w:t>
-      </w:r>
-      <w:proofErr w:type="spellEnd"/>
-      <w:r>
-        <w:t xml:space="preserve"> == True %}and {{</w:t>
-      </w:r>
-      <w:proofErr w:type="spellStart"/>
+        <w:t xml:space="preserve"> {% if joint_language == True %}and {{</w:t>
+      </w:r>
       <w:r>
         <w:t>joint_owner</w:t>
       </w:r>
@@ -994,11 +711,7 @@
         <w:t>.</w:t>
       </w:r>
       <w:r>
-        <w:t>name_full</w:t>
-      </w:r>
-      <w:proofErr w:type="spellEnd"/>
-      <w:r>
-        <w:t>()</w:t>
+        <w:t>name_full()</w:t>
       </w:r>
       <w:r>
         <w:t>}</w:t>
@@ -1007,65 +720,45 @@
         <w:t>}</w:t>
       </w:r>
       <w:r>
-        <w:t xml:space="preserve"> {% endif %}will transfer upon their {{</w:t>
-      </w:r>
-      <w:proofErr w:type="spellStart"/>
-      <w:r>
-        <w:t>death_or_deaths</w:t>
-      </w:r>
-      <w:proofErr w:type="spellEnd"/>
+        <w:t xml:space="preserve"> {% endif %}will transfer upon their {{death_or_deaths}}</w:t>
+      </w:r>
+      <w:r>
+        <w:t xml:space="preserve">{% if other_owners_check != </w:t>
+      </w:r>
+      <w:r>
+        <w:t>“</w:t>
+      </w:r>
+      <w:r>
+        <w:t>sole</w:t>
+      </w:r>
+      <w:r>
+        <w:t>”</w:t>
+      </w:r>
+      <w:r>
+        <w:t xml:space="preserve"> %}{% if </w:t>
+      </w:r>
+      <w:r>
+        <w:t>shared_owners_type</w:t>
+      </w:r>
+      <w:r>
+        <w:t xml:space="preserve"> == “</w:t>
+      </w:r>
+      <w:r>
+        <w:t>Tenancy in common</w:t>
+      </w:r>
+      <w:r>
+        <w:t xml:space="preserve">” %} their </w:t>
+      </w:r>
+      <w:r>
+        <w:t>{{</w:t>
+      </w:r>
+      <w:r>
+        <w:t>user_common_share</w:t>
+      </w:r>
       <w:r>
         <w:t>}}</w:t>
       </w:r>
       <w:r>
-        <w:t xml:space="preserve">{% if </w:t>
-      </w:r>
-      <w:proofErr w:type="spellStart"/>
-      <w:r>
-        <w:t>other_owners_check</w:t>
-      </w:r>
-      <w:proofErr w:type="spellEnd"/>
-      <w:r>
-        <w:t xml:space="preserve"> != </w:t>
-      </w:r>
-      <w:r>
-        <w:t>“</w:t>
-      </w:r>
-      <w:r>
-        <w:t>sole</w:t>
-      </w:r>
-      <w:r>
-        <w:t>”</w:t>
-      </w:r>
-      <w:r>
-        <w:t xml:space="preserve"> %}{% if </w:t>
-      </w:r>
-      <w:proofErr w:type="spellStart"/>
-      <w:r>
-        <w:t>shared_owners_type</w:t>
-      </w:r>
-      <w:proofErr w:type="spellEnd"/>
-      <w:r>
-        <w:t xml:space="preserve"> == “</w:t>
-      </w:r>
-      <w:r>
-        <w:t>Tenancy in common</w:t>
-      </w:r>
-      <w:r>
-        <w:t xml:space="preserve">” %} their </w:t>
-      </w:r>
-      <w:r>
-        <w:t>{{</w:t>
-      </w:r>
-      <w:proofErr w:type="spellStart"/>
-      <w:r>
-        <w:t>user_common_share</w:t>
-      </w:r>
-      <w:proofErr w:type="spellEnd"/>
-      <w:r>
-        <w:t>}}</w:t>
-      </w:r>
-      <w:r>
         <w:t>%</w:t>
       </w:r>
       <w:r>
@@ -1087,37 +780,13 @@
         <w:t>the following real estate</w:t>
       </w:r>
       <w:r>
-        <w:t xml:space="preserve">{% if </w:t>
-      </w:r>
-      <w:proofErr w:type="spellStart"/>
-      <w:r>
-        <w:t>other_owners_check</w:t>
-      </w:r>
-      <w:proofErr w:type="spellEnd"/>
-      <w:r>
-        <w:t xml:space="preserve"> == “sole” %}</w:t>
+        <w:t>{% if other_owners_check == “sole” %}</w:t>
       </w:r>
       <w:r>
         <w:t xml:space="preserve"> in its entirety</w:t>
       </w:r>
       <w:r>
-        <w:t xml:space="preserve">{% </w:t>
-      </w:r>
-      <w:proofErr w:type="spellStart"/>
-      <w:r>
-        <w:t>elif</w:t>
-      </w:r>
-      <w:proofErr w:type="spellEnd"/>
-      <w:r>
-        <w:t xml:space="preserve"> </w:t>
-      </w:r>
-      <w:proofErr w:type="spellStart"/>
-      <w:r>
-        <w:t>joint_language</w:t>
-      </w:r>
-      <w:proofErr w:type="spellEnd"/>
-      <w:r>
-        <w:t xml:space="preserve"> == True %} in its entirety{% endif %}: </w:t>
+        <w:t xml:space="preserve">{% elif joint_language == True %} in its entirety{% endif %}: </w:t>
       </w:r>
     </w:p>
     <w:p>
@@ -1133,24 +802,14 @@
         <w:t>{</w:t>
       </w:r>
       <w:r>
-        <w:t>{</w:t>
-      </w:r>
-      <w:proofErr w:type="spellStart"/>
-      <w:r>
-        <w:t>todi_</w:t>
-      </w:r>
-      <w:proofErr w:type="gramStart"/>
-      <w:r>
-        <w:t>property.</w:t>
+        <w:t>{todi_property.</w:t>
       </w:r>
       <w:r>
         <w:t>line</w:t>
       </w:r>
-      <w:proofErr w:type="gramEnd"/>
       <w:r>
         <w:t>_one</w:t>
       </w:r>
-      <w:proofErr w:type="spellEnd"/>
       <w:r>
         <w:t>(</w:t>
       </w:r>
@@ -1158,37 +817,13 @@
         <w:rPr>
           <w:bCs/>
         </w:rPr>
-        <w:t>bare=</w:t>
-      </w:r>
-      <w:proofErr w:type="gramStart"/>
-      <w:r>
-        <w:rPr>
-          <w:bCs/>
-        </w:rPr>
-        <w:t>True</w:t>
-      </w:r>
-      <w:r>
-        <w:t>)}}</w:t>
-      </w:r>
-      <w:proofErr w:type="gramEnd"/>
-      <w:r>
-        <w:t>, {{</w:t>
-      </w:r>
-      <w:proofErr w:type="spellStart"/>
-      <w:r>
-        <w:t>todi_</w:t>
-      </w:r>
-      <w:proofErr w:type="gramStart"/>
-      <w:r>
-        <w:t>property</w:t>
-      </w:r>
-      <w:r>
-        <w:t>.city</w:t>
-      </w:r>
-      <w:proofErr w:type="spellEnd"/>
-      <w:proofErr w:type="gramEnd"/>
-      <w:r>
-        <w:t>}},</w:t>
+        <w:t>bare=True</w:t>
+      </w:r>
+      <w:r>
+        <w:t>)}}, {{todi_property</w:t>
+      </w:r>
+      <w:r>
+        <w:t>.city}},</w:t>
       </w:r>
       <w:r>
         <w:t xml:space="preserve"> </w:t>
@@ -1196,27 +831,15 @@
       <w:r>
         <w:t>{{</w:t>
       </w:r>
-      <w:proofErr w:type="spellStart"/>
-      <w:r>
-        <w:t>end_in_county</w:t>
-      </w:r>
-      <w:proofErr w:type="spellEnd"/>
-      <w:r>
-        <w:t>(</w:t>
-      </w:r>
-      <w:proofErr w:type="spellStart"/>
-      <w:r>
-        <w:t>todi_</w:t>
-      </w:r>
-      <w:proofErr w:type="gramStart"/>
-      <w:r>
-        <w:t>property</w:t>
+      <w:r>
+        <w:t>end_in_county(</w:t>
+      </w:r>
+      <w:r>
+        <w:t>todi_property</w:t>
       </w:r>
       <w:r>
         <w:t>.county</w:t>
       </w:r>
-      <w:proofErr w:type="spellEnd"/>
-      <w:proofErr w:type="gramEnd"/>
       <w:r>
         <w:t>)</w:t>
       </w:r>
@@ -1224,20 +847,7 @@
         <w:t>}}</w:t>
       </w:r>
       <w:r>
-        <w:t>, {{</w:t>
-      </w:r>
-      <w:proofErr w:type="spellStart"/>
-      <w:r>
-        <w:t>todi_</w:t>
-      </w:r>
-      <w:proofErr w:type="gramStart"/>
-      <w:r>
-        <w:t>property.state</w:t>
-      </w:r>
-      <w:proofErr w:type="spellEnd"/>
-      <w:proofErr w:type="gramEnd"/>
-      <w:r>
-        <w:t>}} {{todi_property</w:t>
+        <w:t>, {{todi_property.state}} {{todi_property</w:t>
       </w:r>
       <w:r>
         <w:t>.zip}}</w:t>
@@ -1251,15 +861,7 @@
         <w:t>Index</w:t>
       </w:r>
       <w:r>
-        <w:t xml:space="preserve"> Number (“PIN”): {{</w:t>
-      </w:r>
-      <w:proofErr w:type="spellStart"/>
-      <w:r>
-        <w:t>todi_property.pin</w:t>
-      </w:r>
-      <w:proofErr w:type="spellEnd"/>
-      <w:r>
-        <w:t>}}</w:t>
+        <w:t xml:space="preserve"> Number (“PIN”): {{todi_property.pin}}</w:t>
       </w:r>
     </w:p>
     <w:p>
@@ -1280,29 +882,7 @@
         <w:rPr>
           <w:bCs/>
         </w:rPr>
-        <w:t>{{</w:t>
-      </w:r>
-      <w:proofErr w:type="spellStart"/>
-      <w:r>
-        <w:rPr>
-          <w:bCs/>
-        </w:rPr>
-        <w:t>todi_</w:t>
-      </w:r>
-      <w:proofErr w:type="gramStart"/>
-      <w:r>
-        <w:rPr>
-          <w:bCs/>
-        </w:rPr>
-        <w:t>property.description</w:t>
-      </w:r>
-      <w:proofErr w:type="spellEnd"/>
-      <w:proofErr w:type="gramEnd"/>
-      <w:r>
-        <w:rPr>
-          <w:bCs/>
-        </w:rPr>
-        <w:t>}}</w:t>
+        <w:t>{{todi_property.description}}</w:t>
       </w:r>
     </w:p>
     <w:p>
@@ -1364,23 +944,7 @@
                 <w:b/>
                 <w:spacing w:val="-4"/>
               </w:rPr>
-              <w:t xml:space="preserve">Beneficiary </w:t>
-            </w:r>
-            <w:proofErr w:type="gramStart"/>
-            <w:r>
-              <w:rPr>
-                <w:b/>
-                <w:spacing w:val="-4"/>
-              </w:rPr>
-              <w:t>Name,  Relationship</w:t>
-            </w:r>
-            <w:proofErr w:type="gramEnd"/>
-            <w:r>
-              <w:rPr>
-                <w:b/>
-                <w:spacing w:val="-4"/>
-              </w:rPr>
-              <w:t xml:space="preserve"> to Owner</w:t>
+              <w:t>Beneficiary Name,  Relationship to Owner</w:t>
             </w:r>
           </w:p>
         </w:tc>
@@ -1430,13 +994,8 @@
     </w:tbl>
     <w:p>
       <w:r>
-        <w:t xml:space="preserve">{% for person in </w:t>
-      </w:r>
-      <w:proofErr w:type="gramStart"/>
-      <w:r>
-        <w:t>beneficiaries %}</w:t>
-      </w:r>
-      <w:proofErr w:type="gramEnd"/>
+        <w:t>{% for person in beneficiaries %}</w:t>
+      </w:r>
     </w:p>
     <w:tbl>
       <w:tblPr>
@@ -1460,31 +1019,14 @@
           </w:tcPr>
           <w:p>
             <w:r>
-              <w:t>{{</w:t>
-            </w:r>
-            <w:proofErr w:type="spellStart"/>
-            <w:r>
-              <w:t>person.</w:t>
-            </w:r>
-            <w:r>
-              <w:t>name_</w:t>
-            </w:r>
-            <w:proofErr w:type="gramStart"/>
-            <w:r>
-              <w:t>full</w:t>
-            </w:r>
-            <w:proofErr w:type="spellEnd"/>
-            <w:r>
-              <w:t>(</w:t>
-            </w:r>
-            <w:proofErr w:type="gramEnd"/>
-            <w:r>
-              <w:t>)</w:t>
+              <w:t>{{person.</w:t>
+            </w:r>
+            <w:r>
+              <w:t>name_full()</w:t>
             </w:r>
             <w:r>
               <w:t>}}</w:t>
             </w:r>
-            <w:proofErr w:type="gramStart"/>
             <w:r>
               <w:t>,</w:t>
             </w:r>
@@ -1492,72 +1034,19 @@
               <w:t xml:space="preserve"> </w:t>
             </w:r>
             <w:r>
-              <w:t>{%</w:t>
-            </w:r>
-            <w:proofErr w:type="gramEnd"/>
-            <w:r>
-              <w:t xml:space="preserve"> if </w:t>
-            </w:r>
-            <w:proofErr w:type="spellStart"/>
-            <w:r>
-              <w:t>joint_language</w:t>
-            </w:r>
-            <w:proofErr w:type="spellEnd"/>
-            <w:r>
-              <w:t xml:space="preserve"> == True </w:t>
-            </w:r>
-            <w:proofErr w:type="gramStart"/>
-            <w:r>
-              <w:t>%}</w:t>
-            </w:r>
-            <w:r>
-              <w:t>{</w:t>
-            </w:r>
-            <w:proofErr w:type="gramEnd"/>
-            <w:r>
-              <w:t>{</w:t>
-            </w:r>
-            <w:proofErr w:type="spellStart"/>
-            <w:proofErr w:type="gramStart"/>
-            <w:r>
-              <w:t>person.relationship</w:t>
-            </w:r>
-            <w:proofErr w:type="gramEnd"/>
+              <w:t>{% if joint_language == True %}</w:t>
+            </w:r>
+            <w:r>
+              <w:t>{{person.relationship</w:t>
+            </w:r>
             <w:r>
               <w:t>_info</w:t>
             </w:r>
-            <w:proofErr w:type="spellEnd"/>
-            <w:proofErr w:type="gramStart"/>
             <w:r>
               <w:t>}}</w:t>
             </w:r>
             <w:r>
-              <w:t>{</w:t>
-            </w:r>
-            <w:proofErr w:type="gramEnd"/>
-            <w:r>
-              <w:t xml:space="preserve">% else </w:t>
-            </w:r>
-            <w:proofErr w:type="gramStart"/>
-            <w:r>
-              <w:t>%}{</w:t>
-            </w:r>
-            <w:proofErr w:type="gramEnd"/>
-            <w:r>
-              <w:t>{</w:t>
-            </w:r>
-            <w:proofErr w:type="spellStart"/>
-            <w:proofErr w:type="gramStart"/>
-            <w:r>
-              <w:t>person.relationship</w:t>
-            </w:r>
-            <w:proofErr w:type="spellEnd"/>
-            <w:r>
-              <w:t>}}{</w:t>
-            </w:r>
-            <w:proofErr w:type="gramEnd"/>
-            <w:r>
-              <w:t>% endif %}</w:t>
+              <w:t>{% else %}{{person.relationship}}{% endif %}</w:t>
             </w:r>
           </w:p>
         </w:tc>
@@ -1567,194 +1056,58 @@
           </w:tcPr>
           <w:p>
             <w:r>
+              <w:t>{% if person.in_america == True %}</w:t>
+            </w:r>
+            <w:r>
+              <w:t>{{person.address.on_one_line(</w:t>
+            </w:r>
+            <w:r>
+              <w:rPr>
+                <w:bCs/>
+              </w:rPr>
+              <w:t>bare=True</w:t>
+            </w:r>
+            <w:r>
+              <w:t>)}}</w:t>
+            </w:r>
+            <w:r>
+              <w:t>{% else %}{{person.intl_address_1}}</w:t>
+            </w:r>
+            <w:r>
+              <w:t>,</w:t>
+            </w:r>
+            <w:r>
+              <w:t xml:space="preserve"> {{person.intl_address_2}}{% endif %}</w:t>
+            </w:r>
+          </w:p>
+        </w:tc>
+        <w:tc>
+          <w:tcPr>
+            <w:tcW w:w="1571" w:type="dxa"/>
+          </w:tcPr>
+          <w:p>
+            <w:r>
               <w:t xml:space="preserve">{% if </w:t>
             </w:r>
-            <w:proofErr w:type="spellStart"/>
-            <w:r>
-              <w:t>person.in_america</w:t>
-            </w:r>
-            <w:proofErr w:type="spellEnd"/>
-            <w:r>
-              <w:t xml:space="preserve"> == True </w:t>
-            </w:r>
-            <w:proofErr w:type="gramStart"/>
-            <w:r>
-              <w:t>%}</w:t>
-            </w:r>
-            <w:r>
-              <w:t>{</w:t>
-            </w:r>
-            <w:proofErr w:type="gramEnd"/>
-            <w:r>
-              <w:t>{</w:t>
-            </w:r>
-            <w:proofErr w:type="spellStart"/>
-            <w:proofErr w:type="gramStart"/>
-            <w:r>
-              <w:t>person.address</w:t>
-            </w:r>
-            <w:proofErr w:type="gramEnd"/>
-            <w:r>
-              <w:t>.on_one_line</w:t>
-            </w:r>
-            <w:proofErr w:type="spellEnd"/>
-            <w:r>
-              <w:t>(</w:t>
-            </w:r>
-            <w:r>
-              <w:rPr>
-                <w:bCs/>
-              </w:rPr>
-              <w:t>bare=True</w:t>
-            </w:r>
-            <w:r>
-              <w:t>)</w:t>
-            </w:r>
-            <w:proofErr w:type="gramStart"/>
-            <w:r>
-              <w:t>}}</w:t>
-            </w:r>
-            <w:r>
-              <w:t>{</w:t>
-            </w:r>
-            <w:proofErr w:type="gramEnd"/>
-            <w:r>
-              <w:t xml:space="preserve">% else </w:t>
-            </w:r>
-            <w:proofErr w:type="gramStart"/>
-            <w:r>
-              <w:t>%}{</w:t>
-            </w:r>
-            <w:proofErr w:type="gramEnd"/>
-            <w:r>
-              <w:t>{</w:t>
-            </w:r>
-            <w:proofErr w:type="gramStart"/>
-            <w:r>
-              <w:t>person.intl</w:t>
-            </w:r>
-            <w:proofErr w:type="gramEnd"/>
-            <w:r>
-              <w:t>_address_</w:t>
-            </w:r>
-            <w:proofErr w:type="gramStart"/>
-            <w:r>
-              <w:t>1}}</w:t>
-            </w:r>
-            <w:r>
-              <w:t>,</w:t>
-            </w:r>
-            <w:r>
-              <w:t xml:space="preserve"> {{person.intl</w:t>
-            </w:r>
-            <w:proofErr w:type="gramEnd"/>
-            <w:r>
-              <w:t>_address_2</w:t>
-            </w:r>
-            <w:proofErr w:type="gramStart"/>
-            <w:r>
-              <w:t>}}{</w:t>
-            </w:r>
-            <w:proofErr w:type="gramEnd"/>
-            <w:r>
-              <w:t>% endif %}</w:t>
-            </w:r>
-          </w:p>
-        </w:tc>
-        <w:tc>
-          <w:tcPr>
-            <w:tcW w:w="1571" w:type="dxa"/>
-          </w:tcPr>
-          <w:p>
-            <w:r>
-              <w:t xml:space="preserve">{% if </w:t>
-            </w:r>
-            <w:proofErr w:type="spellStart"/>
             <w:r>
               <w:t>percentage_short_enough</w:t>
             </w:r>
-            <w:proofErr w:type="spellEnd"/>
-            <w:r>
-              <w:t>(</w:t>
-            </w:r>
-            <w:proofErr w:type="spellStart"/>
-            <w:proofErr w:type="gramStart"/>
-            <w:r>
-              <w:t>person.percent</w:t>
-            </w:r>
-            <w:proofErr w:type="gramEnd"/>
-            <w:r>
-              <w:t>_share</w:t>
-            </w:r>
-            <w:proofErr w:type="spellEnd"/>
-            <w:r>
-              <w:t>) == False %}</w:t>
-            </w:r>
-            <w:r>
-              <w:t>1/{{</w:t>
-            </w:r>
-            <w:proofErr w:type="spellStart"/>
-            <w:proofErr w:type="gramStart"/>
-            <w:r>
-              <w:t>beneficiaries.number</w:t>
-            </w:r>
-            <w:proofErr w:type="gramEnd"/>
-            <w:r>
-              <w:t>_</w:t>
-            </w:r>
-            <w:proofErr w:type="gramStart"/>
-            <w:r>
-              <w:t>gathered</w:t>
-            </w:r>
-            <w:proofErr w:type="spellEnd"/>
-            <w:r>
-              <w:t>(</w:t>
-            </w:r>
-            <w:proofErr w:type="gramEnd"/>
-            <w:r>
-              <w:t>)</w:t>
-            </w:r>
-            <w:proofErr w:type="gramStart"/>
-            <w:r>
-              <w:t>}}{</w:t>
-            </w:r>
-            <w:proofErr w:type="gramEnd"/>
-            <w:r>
-              <w:t xml:space="preserve">% else </w:t>
-            </w:r>
-            <w:proofErr w:type="gramStart"/>
-            <w:r>
-              <w:t>%}</w:t>
-            </w:r>
-            <w:r>
-              <w:t>{</w:t>
-            </w:r>
-            <w:proofErr w:type="gramEnd"/>
-            <w:r>
-              <w:t>{</w:t>
-            </w:r>
-            <w:proofErr w:type="spellStart"/>
-            <w:proofErr w:type="gramStart"/>
-            <w:r>
-              <w:t>person.</w:t>
+            <w:r>
+              <w:t>(person.percent_share) == False %}</w:t>
+            </w:r>
+            <w:r>
+              <w:t>1/{{beneficiaries.number_gathered()}}{% else %}</w:t>
+            </w:r>
+            <w:r>
+              <w:t>{{person.</w:t>
             </w:r>
             <w:r>
               <w:lastRenderedPageBreak/>
-              <w:t>percent</w:t>
-            </w:r>
-            <w:proofErr w:type="gramEnd"/>
-            <w:r>
-              <w:t>_share</w:t>
-            </w:r>
-            <w:proofErr w:type="spellEnd"/>
-            <w:proofErr w:type="gramStart"/>
-            <w:r>
-              <w:t>}}</w:t>
+              <w:t>percent_share}}</w:t>
             </w:r>
             <w:r>
               <w:t>%</w:t>
             </w:r>
-            <w:proofErr w:type="gramEnd"/>
             <w:r>
               <w:t>{% endif %}</w:t>
             </w:r>
@@ -1772,15 +1125,7 @@
     <w:p>
       <w:r>
         <w:lastRenderedPageBreak/>
-        <w:t xml:space="preserve">{% </w:t>
-      </w:r>
-      <w:proofErr w:type="spellStart"/>
-      <w:r>
-        <w:t>endfor</w:t>
-      </w:r>
-      <w:proofErr w:type="spellEnd"/>
-      <w:r>
-        <w:t xml:space="preserve"> %}</w:t>
+        <w:t>{% endfor %}</w:t>
       </w:r>
     </w:p>
     <w:p>
@@ -1793,312 +1138,161 @@
     </w:p>
     <w:p>
       <w:r>
-        <w:t xml:space="preserve">{%p for person in </w:t>
-      </w:r>
-      <w:proofErr w:type="gramStart"/>
-      <w:r>
-        <w:t>beneficiaries %}</w:t>
-      </w:r>
-      <w:proofErr w:type="gramEnd"/>
+        <w:t>{%p for person in beneficiaries %}</w:t>
+      </w:r>
     </w:p>
     <w:p>
       <w:r>
-        <w:t xml:space="preserve">{%p if </w:t>
-      </w:r>
-      <w:proofErr w:type="spellStart"/>
-      <w:r>
-        <w:t>person.</w:t>
+        <w:t>{%p if person.</w:t>
       </w:r>
       <w:r>
         <w:t>has_successor</w:t>
       </w:r>
-      <w:proofErr w:type="spellEnd"/>
-      <w:r>
-        <w:t xml:space="preserve"> == </w:t>
-      </w:r>
-      <w:proofErr w:type="gramStart"/>
-      <w:r>
-        <w:t>True %}</w:t>
-      </w:r>
-      <w:proofErr w:type="gramEnd"/>
+      <w:r>
+        <w:t xml:space="preserve"> == True %}</w:t>
+      </w:r>
     </w:p>
     <w:p>
       <w:r>
         <w:t xml:space="preserve">If </w:t>
       </w:r>
       <w:r>
+        <w:t>{{person.</w:t>
+      </w:r>
+      <w:r>
+        <w:t>name_full()</w:t>
+      </w:r>
+      <w:r>
+        <w:t>}</w:t>
+      </w:r>
+      <w:r>
+        <w:t>}</w:t>
+      </w:r>
+      <w:r>
+        <w:t xml:space="preserve"> pre</w:t>
+      </w:r>
+      <w:r>
+        <w:t>d</w:t>
+      </w:r>
+      <w:r>
+        <w:t xml:space="preserve">eceases </w:t>
+      </w:r>
+      <w:r>
+        <w:t>{{ me_or_us}}</w:t>
+      </w:r>
+      <w:r>
+        <w:t>, then</w:t>
+      </w:r>
+      <w:r>
+        <w:t xml:space="preserve"> </w:t>
+      </w:r>
+      <w:r>
+        <w:t xml:space="preserve">{% if joint_language == False %}my </w:t>
+      </w:r>
+      <w:r>
+        <w:t>{{person.</w:t>
+      </w:r>
+      <w:r>
+        <w:t xml:space="preserve"> </w:t>
+      </w:r>
+      <w:r>
+        <w:t>successor_beneficiary.relationship</w:t>
+      </w:r>
+      <w:r>
+        <w:t>.lower()</w:t>
+      </w:r>
+      <w:r>
+        <w:t>}}</w:t>
+      </w:r>
+      <w:r>
+        <w:t xml:space="preserve"> </w:t>
+      </w:r>
+      <w:r>
+        <w:t>{{person.succes</w:t>
+      </w:r>
+      <w:r>
+        <w:t>s</w:t>
+      </w:r>
+      <w:r>
+        <w:t>or_beneficiary.</w:t>
+      </w:r>
+      <w:r>
+        <w:t>name_full()</w:t>
+      </w:r>
+      <w:r>
+        <w:t>}} of {{</w:t>
+      </w:r>
+      <w:r>
+        <w:t>person.successor_beneficiary.address.city</w:t>
+      </w:r>
+      <w:r>
+        <w:t xml:space="preserve">}}, </w:t>
+      </w:r>
+      <w:r>
+        <w:t>{% if person.successor_beneficiary.in_america == True %}</w:t>
+      </w:r>
+      <w:r>
         <w:t>{{</w:t>
       </w:r>
-      <w:proofErr w:type="spellStart"/>
-      <w:r>
-        <w:t>person.</w:t>
-      </w:r>
-      <w:r>
-        <w:t>name_</w:t>
-      </w:r>
-      <w:proofErr w:type="gramStart"/>
-      <w:r>
-        <w:t>full</w:t>
-      </w:r>
-      <w:proofErr w:type="spellEnd"/>
+      <w:r>
+        <w:t>person.successor_beneficiary.address.</w:t>
+      </w:r>
+      <w:r>
+        <w:t>state}}</w:t>
+      </w:r>
+      <w:r>
+        <w:t>{% else %}</w:t>
+      </w:r>
+      <w:r>
+        <w:t>{{person.successor_beneficiary.country}}{% endif %}</w:t>
+      </w:r>
+      <w:r>
+        <w:t>{% else %}{{person.successor_beneficiary.</w:t>
+      </w:r>
+      <w:r>
+        <w:t>name_full()</w:t>
+      </w:r>
+      <w:r>
+        <w:t xml:space="preserve">}} </w:t>
+      </w:r>
       <w:r>
         <w:t>(</w:t>
       </w:r>
-      <w:proofErr w:type="gramEnd"/>
+      <w:r>
+        <w:t>{{person.successor_beneficiary.relationship_info}}</w:t>
+      </w:r>
       <w:r>
         <w:t>)</w:t>
       </w:r>
       <w:r>
-        <w:t>}</w:t>
-      </w:r>
-      <w:r>
-        <w:t>}</w:t>
-      </w:r>
-      <w:r>
-        <w:t xml:space="preserve"> pre</w:t>
-      </w:r>
-      <w:r>
-        <w:t>d</w:t>
-      </w:r>
-      <w:r>
-        <w:t xml:space="preserve">eceases </w:t>
-      </w:r>
-      <w:proofErr w:type="gramStart"/>
-      <w:r>
-        <w:t xml:space="preserve">{{ </w:t>
-      </w:r>
-      <w:proofErr w:type="spellStart"/>
-      <w:r>
-        <w:t>me</w:t>
-      </w:r>
-      <w:proofErr w:type="gramEnd"/>
-      <w:r>
-        <w:t>_or_</w:t>
-      </w:r>
-      <w:proofErr w:type="gramStart"/>
-      <w:r>
-        <w:t>us</w:t>
-      </w:r>
-      <w:proofErr w:type="spellEnd"/>
-      <w:r>
-        <w:t>}}</w:t>
-      </w:r>
-      <w:r>
-        <w:t>,</w:t>
-      </w:r>
-      <w:proofErr w:type="gramEnd"/>
+        <w:t xml:space="preserve"> of</w:t>
+      </w:r>
       <w:r>
         <w:t xml:space="preserve"> </w:t>
       </w:r>
-      <w:proofErr w:type="gramStart"/>
-      <w:r>
-        <w:t>then</w:t>
-      </w:r>
-      <w:r>
-        <w:t xml:space="preserve"> </w:t>
-      </w:r>
-      <w:r>
-        <w:t>{%</w:t>
-      </w:r>
-      <w:proofErr w:type="gramEnd"/>
-      <w:r>
-        <w:t xml:space="preserve"> if </w:t>
-      </w:r>
-      <w:proofErr w:type="spellStart"/>
-      <w:r>
-        <w:t>joint_language</w:t>
-      </w:r>
-      <w:proofErr w:type="spellEnd"/>
-      <w:r>
-        <w:t xml:space="preserve"> == </w:t>
-      </w:r>
-      <w:proofErr w:type="gramStart"/>
-      <w:r>
-        <w:t>False %}</w:t>
-      </w:r>
-      <w:proofErr w:type="gramEnd"/>
-      <w:r>
-        <w:t xml:space="preserve">my </w:t>
-      </w:r>
-      <w:r>
-        <w:t>{{person.</w:t>
-      </w:r>
-      <w:r>
-        <w:t xml:space="preserve"> </w:t>
-      </w:r>
-      <w:proofErr w:type="spellStart"/>
-      <w:r>
-        <w:t>successor_beneficiary.relationship</w:t>
-      </w:r>
-      <w:r>
-        <w:t>.lower</w:t>
-      </w:r>
-      <w:proofErr w:type="spellEnd"/>
-      <w:r>
-        <w:t>()</w:t>
-      </w:r>
-      <w:r>
-        <w:t>}}</w:t>
-      </w:r>
-      <w:r>
-        <w:t xml:space="preserve"> </w:t>
-      </w:r>
       <w:r>
         <w:t>{{</w:t>
       </w:r>
-      <w:proofErr w:type="spellStart"/>
-      <w:r>
-        <w:t>person.succes</w:t>
-      </w:r>
-      <w:r>
-        <w:t>s</w:t>
-      </w:r>
-      <w:r>
-        <w:t>or_beneficiary.</w:t>
-      </w:r>
-      <w:r>
-        <w:t>name_full</w:t>
-      </w:r>
-      <w:proofErr w:type="spellEnd"/>
-      <w:r>
-        <w:t>()</w:t>
-      </w:r>
-      <w:r>
-        <w:t>}} of {{</w:t>
-      </w:r>
-      <w:proofErr w:type="spellStart"/>
       <w:r>
         <w:t>person.successor_beneficiary.address.city</w:t>
       </w:r>
-      <w:proofErr w:type="spellEnd"/>
       <w:r>
         <w:t xml:space="preserve">}}, </w:t>
       </w:r>
       <w:r>
-        <w:t xml:space="preserve">{% if </w:t>
-      </w:r>
-      <w:proofErr w:type="spellStart"/>
-      <w:r>
-        <w:t>person.successor_beneficiary.in_america</w:t>
-      </w:r>
-      <w:proofErr w:type="spellEnd"/>
-      <w:r>
-        <w:t xml:space="preserve"> == True %}</w:t>
-      </w:r>
-      <w:r>
-        <w:t>{{</w:t>
-      </w:r>
-      <w:proofErr w:type="spellStart"/>
+        <w:t>{% if person.successor_beneficiary.in_america == True %}{{</w:t>
+      </w:r>
       <w:r>
         <w:t>person.successor_beneficiary.address.</w:t>
       </w:r>
       <w:r>
-        <w:t>state</w:t>
-      </w:r>
-      <w:proofErr w:type="spellEnd"/>
-      <w:r>
-        <w:t>}}</w:t>
+        <w:t>state}}</w:t>
       </w:r>
       <w:r>
         <w:t>{% else %}</w:t>
       </w:r>
       <w:r>
-        <w:t>{{</w:t>
-      </w:r>
-      <w:proofErr w:type="spellStart"/>
-      <w:r>
-        <w:t>person.successor_beneficiary.country</w:t>
-      </w:r>
-      <w:proofErr w:type="spellEnd"/>
-      <w:r>
-        <w:t>}}{% endif %}</w:t>
-      </w:r>
-      <w:r>
-        <w:t>{% else %}{{</w:t>
-      </w:r>
-      <w:proofErr w:type="spellStart"/>
-      <w:r>
-        <w:t>person.successor_beneficiary.</w:t>
-      </w:r>
-      <w:r>
-        <w:t>name_full</w:t>
-      </w:r>
-      <w:proofErr w:type="spellEnd"/>
-      <w:r>
-        <w:t>()</w:t>
-      </w:r>
-      <w:r>
-        <w:t xml:space="preserve">}} </w:t>
-      </w:r>
-      <w:r>
-        <w:t>(</w:t>
-      </w:r>
-      <w:r>
-        <w:t>{{</w:t>
-      </w:r>
-      <w:proofErr w:type="spellStart"/>
-      <w:r>
-        <w:t>person.successor_beneficiary.relationship_info</w:t>
-      </w:r>
-      <w:proofErr w:type="spellEnd"/>
-      <w:r>
-        <w:t>}}</w:t>
-      </w:r>
-      <w:r>
-        <w:t>)</w:t>
-      </w:r>
-      <w:r>
-        <w:t xml:space="preserve"> of</w:t>
-      </w:r>
-      <w:r>
-        <w:t xml:space="preserve"> </w:t>
-      </w:r>
-      <w:r>
-        <w:t>{{</w:t>
-      </w:r>
-      <w:proofErr w:type="spellStart"/>
-      <w:r>
-        <w:t>person.successor_beneficiary.address.city</w:t>
-      </w:r>
-      <w:proofErr w:type="spellEnd"/>
-      <w:r>
-        <w:t xml:space="preserve">}}, </w:t>
-      </w:r>
-      <w:r>
-        <w:t xml:space="preserve">{% if </w:t>
-      </w:r>
-      <w:proofErr w:type="spellStart"/>
-      <w:r>
-        <w:t>person.successor_beneficiary.in_america</w:t>
-      </w:r>
-      <w:proofErr w:type="spellEnd"/>
-      <w:r>
-        <w:t xml:space="preserve"> == True %}{{</w:t>
-      </w:r>
-      <w:proofErr w:type="spellStart"/>
-      <w:r>
-        <w:t>person.successor_beneficiary.address.</w:t>
-      </w:r>
-      <w:r>
-        <w:t>state</w:t>
-      </w:r>
-      <w:proofErr w:type="spellEnd"/>
-      <w:r>
-        <w:t>}}</w:t>
-      </w:r>
-      <w:r>
-        <w:t>{% else %}</w:t>
-      </w:r>
-      <w:r>
-        <w:t>{{</w:t>
-      </w:r>
-      <w:proofErr w:type="spellStart"/>
-      <w:r>
-        <w:t>person.successor_beneficiary.country</w:t>
-      </w:r>
-      <w:proofErr w:type="spellEnd"/>
-      <w:r>
-        <w:t>}}{% endif %}</w:t>
+        <w:t>{{person.successor_beneficiary.country}}{% endif %}</w:t>
       </w:r>
       <w:r>
         <w:t xml:space="preserve">{% endif %} </w:t>
@@ -2107,15 +1301,7 @@
         <w:t xml:space="preserve">is </w:t>
       </w:r>
       <w:r>
-        <w:t>{{</w:t>
-      </w:r>
-      <w:proofErr w:type="spellStart"/>
-      <w:r>
-        <w:t>my_or_our</w:t>
-      </w:r>
-      <w:proofErr w:type="spellEnd"/>
-      <w:r>
-        <w:t>}}</w:t>
+        <w:t>{{my_or_our}}</w:t>
       </w:r>
       <w:r>
         <w:t xml:space="preserve"> successor beneficiary</w:t>
@@ -2134,28 +1320,13 @@
     </w:p>
     <w:p>
       <w:r>
-        <w:t xml:space="preserve">{%p </w:t>
-      </w:r>
-      <w:proofErr w:type="gramStart"/>
-      <w:r>
-        <w:t>endif %}</w:t>
-      </w:r>
-      <w:proofErr w:type="gramEnd"/>
+        <w:t>{%p endif %}</w:t>
+      </w:r>
     </w:p>
     <w:p>
       <w:r>
-        <w:t xml:space="preserve">{%p </w:t>
-      </w:r>
-      <w:proofErr w:type="spellStart"/>
-      <w:proofErr w:type="gramStart"/>
-      <w:r>
-        <w:t>endfor</w:t>
-      </w:r>
-      <w:proofErr w:type="spellEnd"/>
-      <w:r>
-        <w:t xml:space="preserve"> %}</w:t>
-      </w:r>
-      <w:proofErr w:type="gramEnd"/>
+        <w:t>{%p endfor %}</w:t>
+      </w:r>
     </w:p>
     <w:p>
       <w:pPr>
@@ -2170,13 +1341,8 @@
       <w:r>
         <w:t xml:space="preserve">{% if </w:t>
       </w:r>
-      <w:proofErr w:type="spellStart"/>
-      <w:r>
-        <w:t>beneficiaries.number</w:t>
-      </w:r>
-      <w:proofErr w:type="spellEnd"/>
-      <w:r>
-        <w:t>()</w:t>
+      <w:r>
+        <w:t>beneficiaries.number()</w:t>
       </w:r>
       <w:r>
         <w:t xml:space="preserve"> == 1 %}</w:t>
@@ -2185,54 +1351,22 @@
         <w:t xml:space="preserve">Upon </w:t>
       </w:r>
       <w:r>
-        <w:t>{{</w:t>
-      </w:r>
-      <w:proofErr w:type="spellStart"/>
-      <w:r>
-        <w:t>my_or_our</w:t>
-      </w:r>
-      <w:proofErr w:type="spellEnd"/>
-      <w:r>
-        <w:t xml:space="preserve">}} </w:t>
-      </w:r>
-      <w:r>
-        <w:t>{{</w:t>
-      </w:r>
-      <w:proofErr w:type="spellStart"/>
-      <w:r>
-        <w:t>death_or_deaths</w:t>
-      </w:r>
-      <w:proofErr w:type="spellEnd"/>
-      <w:r>
-        <w:t>}}</w:t>
+        <w:t xml:space="preserve">{{my_or_our}} </w:t>
+      </w:r>
+      <w:r>
+        <w:t>{{death_or_deaths}}</w:t>
       </w:r>
       <w:r>
         <w:t xml:space="preserve">, </w:t>
       </w:r>
       <w:r>
-        <w:t>{{</w:t>
-      </w:r>
-      <w:proofErr w:type="spellStart"/>
-      <w:r>
-        <w:t>i_or_we</w:t>
-      </w:r>
-      <w:proofErr w:type="spellEnd"/>
-      <w:r>
-        <w:t>}}</w:t>
+        <w:t>{{i_or_we}}</w:t>
       </w:r>
       <w:r>
         <w:t xml:space="preserve"> transfer </w:t>
       </w:r>
       <w:r>
-        <w:t>{{</w:t>
-      </w:r>
-      <w:proofErr w:type="spellStart"/>
-      <w:r>
-        <w:t>my_or_our</w:t>
-      </w:r>
-      <w:proofErr w:type="spellEnd"/>
-      <w:r>
-        <w:t xml:space="preserve">}} </w:t>
+        <w:t xml:space="preserve">{{my_or_our}} </w:t>
       </w:r>
       <w:r>
         <w:t>interest in the above described property to the beneficiary designated above.</w:t>
@@ -2244,68 +1378,28 @@
         <w:t xml:space="preserve">Upon </w:t>
       </w:r>
       <w:r>
-        <w:t>{{</w:t>
-      </w:r>
-      <w:proofErr w:type="spellStart"/>
-      <w:r>
-        <w:t>my_or_our</w:t>
-      </w:r>
-      <w:proofErr w:type="spellEnd"/>
-      <w:r>
-        <w:t xml:space="preserve">}} </w:t>
-      </w:r>
-      <w:r>
-        <w:t>{{</w:t>
-      </w:r>
-      <w:proofErr w:type="spellStart"/>
-      <w:r>
-        <w:t>death_or_deaths</w:t>
-      </w:r>
-      <w:proofErr w:type="spellEnd"/>
-      <w:r>
-        <w:t>}}</w:t>
+        <w:t xml:space="preserve">{{my_or_our}} </w:t>
+      </w:r>
+      <w:r>
+        <w:t>{{death_or_deaths}}</w:t>
       </w:r>
       <w:r>
         <w:t xml:space="preserve">, </w:t>
       </w:r>
       <w:r>
-        <w:t>{{</w:t>
-      </w:r>
-      <w:proofErr w:type="spellStart"/>
-      <w:r>
-        <w:t>i_or_we</w:t>
-      </w:r>
-      <w:proofErr w:type="spellEnd"/>
-      <w:r>
-        <w:t>}}</w:t>
+        <w:t>{{i_or_we}}</w:t>
       </w:r>
       <w:r>
         <w:t xml:space="preserve"> transfer </w:t>
       </w:r>
       <w:r>
-        <w:t>{{</w:t>
-      </w:r>
-      <w:proofErr w:type="spellStart"/>
-      <w:r>
-        <w:t>my_or_our</w:t>
-      </w:r>
-      <w:proofErr w:type="spellEnd"/>
-      <w:r>
-        <w:t xml:space="preserve">}} </w:t>
+        <w:t xml:space="preserve">{{my_or_our}} </w:t>
       </w:r>
       <w:r>
         <w:t xml:space="preserve">interest in the above described property to the beneficiaries designated above as </w:t>
       </w:r>
       <w:r>
-        <w:t>{{</w:t>
-      </w:r>
-      <w:proofErr w:type="spellStart"/>
-      <w:r>
-        <w:t>tenancy_type</w:t>
-      </w:r>
-      <w:proofErr w:type="spellEnd"/>
-      <w:r>
-        <w:t>}}</w:t>
+        <w:t>{{tenancy_type}}</w:t>
       </w:r>
       <w:r>
         <w:t>.</w:t>
@@ -2662,70 +1756,22 @@
         </mc:AlternateContent>
       </w:r>
       <w:r>
-        <w:t xml:space="preserve">This instrument revokes </w:t>
-      </w:r>
-      <w:proofErr w:type="gramStart"/>
-      <w:r>
-        <w:t>any and all</w:t>
-      </w:r>
-      <w:proofErr w:type="gramEnd"/>
-      <w:r>
-        <w:t xml:space="preserve"> prior transfer on death instruments made by the </w:t>
-      </w:r>
-      <w:proofErr w:type="gramStart"/>
-      <w:r>
-        <w:t>above mentioned</w:t>
-      </w:r>
-      <w:proofErr w:type="gramEnd"/>
-      <w:r>
-        <w:t xml:space="preserve"> owner for the </w:t>
-      </w:r>
-      <w:proofErr w:type="gramStart"/>
-      <w:r>
-        <w:t>above mentioned</w:t>
-      </w:r>
-      <w:proofErr w:type="gramEnd"/>
-      <w:r>
-        <w:t xml:space="preserve"> real estate. Before </w:t>
-      </w:r>
-      <w:r>
-        <w:t>{{</w:t>
-      </w:r>
-      <w:proofErr w:type="spellStart"/>
-      <w:r>
-        <w:t>my_or_our</w:t>
-      </w:r>
-      <w:proofErr w:type="spellEnd"/>
-      <w:r>
-        <w:t>}}</w:t>
+        <w:t xml:space="preserve">This instrument revokes any and all prior transfer on death instruments made by the above mentioned owner for the above mentioned real estate. Before </w:t>
+      </w:r>
+      <w:r>
+        <w:t>{{my_or_our}}</w:t>
       </w:r>
       <w:r>
         <w:t xml:space="preserve"> </w:t>
       </w:r>
       <w:r>
-        <w:t>{{</w:t>
-      </w:r>
-      <w:proofErr w:type="spellStart"/>
-      <w:r>
-        <w:t>death_or_deaths</w:t>
-      </w:r>
-      <w:proofErr w:type="spellEnd"/>
-      <w:r>
-        <w:t>}}</w:t>
+        <w:t>{{death_or_deaths}}</w:t>
       </w:r>
       <w:r>
         <w:t xml:space="preserve">, </w:t>
       </w:r>
       <w:r>
-        <w:t>{{</w:t>
-      </w:r>
-      <w:proofErr w:type="spellStart"/>
-      <w:r>
-        <w:t>i_or_we</w:t>
-      </w:r>
-      <w:proofErr w:type="spellEnd"/>
-      <w:r>
-        <w:t>}}</w:t>
+        <w:t>{{i_or_we}}</w:t>
       </w:r>
       <w:r>
         <w:t xml:space="preserve"> have the right to revoke this instrument.</w:t>
@@ -2751,11 +1797,9 @@
       <w:r>
         <w:t>{{</w:t>
       </w:r>
-      <w:proofErr w:type="spellStart"/>
       <w:r>
         <w:t>owners_apostrophe</w:t>
       </w:r>
-      <w:proofErr w:type="spellEnd"/>
       <w:r>
         <w:t>}}</w:t>
       </w:r>
@@ -2763,53 +1807,17 @@
         <w:t xml:space="preserve"> </w:t>
       </w:r>
       <w:r>
-        <w:t>{{</w:t>
-      </w:r>
-      <w:proofErr w:type="spellStart"/>
-      <w:r>
-        <w:t>death_or_deaths</w:t>
-      </w:r>
-      <w:proofErr w:type="spellEnd"/>
-      <w:r>
-        <w:t>}}</w:t>
-      </w:r>
-      <w:r>
-        <w:t xml:space="preserve"> in the public records in the office of the recorder of the county in which any part of the real estate is </w:t>
-      </w:r>
-      <w:proofErr w:type="gramStart"/>
-      <w:r>
-        <w:t>located.</w:t>
+        <w:t>{{death_or_deaths}}</w:t>
+      </w:r>
+      <w:r>
+        <w:t xml:space="preserve"> in the public records in the office of the recorder of the county in which any part of the real estate is located.</w:t>
       </w:r>
       <w:r>
         <w:rPr>
           <w:sz w:val="20"/>
           <w:szCs w:val="20"/>
         </w:rPr>
-        <w:t>{</w:t>
-      </w:r>
-      <w:proofErr w:type="gramEnd"/>
-      <w:r>
-        <w:rPr>
-          <w:sz w:val="20"/>
-          <w:szCs w:val="20"/>
-        </w:rPr>
-        <w:t xml:space="preserve">% if </w:t>
-      </w:r>
-      <w:proofErr w:type="spellStart"/>
-      <w:r>
-        <w:rPr>
-          <w:sz w:val="20"/>
-          <w:szCs w:val="20"/>
-        </w:rPr>
-        <w:t>joint_language</w:t>
-      </w:r>
-      <w:proofErr w:type="spellEnd"/>
-      <w:r>
-        <w:rPr>
-          <w:sz w:val="20"/>
-          <w:szCs w:val="20"/>
-        </w:rPr>
-        <w:t xml:space="preserve"> == False %}</w:t>
+        <w:t>{% if joint_language == False %}</w:t>
       </w:r>
     </w:p>
     <w:tbl>
@@ -2921,33 +1929,11 @@
               </w:rPr>
               <w:t>.</w:t>
             </w:r>
-            <w:proofErr w:type="spellStart"/>
             <w:r>
               <w:rPr>
                 <w:bCs/>
               </w:rPr>
-              <w:t>name_</w:t>
-            </w:r>
-            <w:proofErr w:type="gramStart"/>
-            <w:r>
-              <w:rPr>
-                <w:bCs/>
-              </w:rPr>
-              <w:t>full</w:t>
-            </w:r>
-            <w:proofErr w:type="spellEnd"/>
-            <w:r>
-              <w:rPr>
-                <w:bCs/>
-              </w:rPr>
-              <w:t>(</w:t>
-            </w:r>
-            <w:proofErr w:type="gramEnd"/>
-            <w:r>
-              <w:rPr>
-                <w:bCs/>
-              </w:rPr>
-              <w:t>)</w:t>
+              <w:t>name_full()</w:t>
             </w:r>
             <w:r>
               <w:rPr>
@@ -2992,33 +1978,15 @@
       <w:r>
         <w:t xml:space="preserve">{% </w:t>
       </w:r>
-      <w:proofErr w:type="spellStart"/>
       <w:r>
         <w:t>el</w:t>
       </w:r>
       <w:r>
-        <w:t>if</w:t>
-      </w:r>
-      <w:proofErr w:type="spellEnd"/>
-      <w:r>
-        <w:t xml:space="preserve"> </w:t>
-      </w:r>
-      <w:proofErr w:type="spellStart"/>
-      <w:r>
-        <w:t>joint_language</w:t>
-      </w:r>
-      <w:proofErr w:type="spellEnd"/>
-      <w:r>
-        <w:t xml:space="preserve"> == </w:t>
-      </w:r>
-      <w:proofErr w:type="gramStart"/>
-      <w:r>
-        <w:t>True</w:t>
+        <w:t>if joint_language == True</w:t>
       </w:r>
       <w:r>
         <w:t xml:space="preserve"> %}</w:t>
       </w:r>
-      <w:proofErr w:type="gramEnd"/>
     </w:p>
     <w:p>
       <w:pPr>
@@ -3116,21 +2084,8 @@
             <w:r>
               <w:t>{{users[0].</w:t>
             </w:r>
-            <w:proofErr w:type="spellStart"/>
-            <w:r>
-              <w:t>name_</w:t>
-            </w:r>
-            <w:proofErr w:type="gramStart"/>
-            <w:r>
-              <w:t>full</w:t>
-            </w:r>
-            <w:proofErr w:type="spellEnd"/>
-            <w:r>
-              <w:t>(</w:t>
-            </w:r>
-            <w:proofErr w:type="gramEnd"/>
-            <w:r>
-              <w:t>)</w:t>
+            <w:r>
+              <w:t>name_full()</w:t>
             </w:r>
             <w:r>
               <w:t>}</w:t>
@@ -3285,41 +2240,13 @@
               <w:rPr>
                 <w:bCs/>
               </w:rPr>
-              <w:t>{{</w:t>
-            </w:r>
-            <w:proofErr w:type="spellStart"/>
+              <w:t>{{joint_owner.</w:t>
+            </w:r>
             <w:r>
               <w:rPr>
                 <w:bCs/>
               </w:rPr>
-              <w:t>joint_owner.</w:t>
-            </w:r>
-            <w:r>
-              <w:rPr>
-                <w:bCs/>
-              </w:rPr>
-              <w:t>name_</w:t>
-            </w:r>
-            <w:proofErr w:type="gramStart"/>
-            <w:r>
-              <w:rPr>
-                <w:bCs/>
-              </w:rPr>
-              <w:t>full</w:t>
-            </w:r>
-            <w:proofErr w:type="spellEnd"/>
-            <w:r>
-              <w:rPr>
-                <w:bCs/>
-              </w:rPr>
-              <w:t>(</w:t>
-            </w:r>
-            <w:proofErr w:type="gramEnd"/>
-            <w:r>
-              <w:rPr>
-                <w:bCs/>
-              </w:rPr>
-              <w:t>)</w:t>
+              <w:t>name_full()</w:t>
             </w:r>
             <w:r>
               <w:rPr>
@@ -3368,18 +2295,10 @@
         </w:rPr>
       </w:pPr>
       <w:r>
-        <w:t xml:space="preserve">{% endif </w:t>
-      </w:r>
-      <w:proofErr w:type="gramStart"/>
-      <w:r>
-        <w:t>%}</w:t>
-      </w:r>
-      <w:r>
-        <w:t>{</w:t>
-      </w:r>
-      <w:proofErr w:type="gramEnd"/>
-      <w:r>
-        <w:t xml:space="preserve">% </w:t>
+        <w:t>{% endif %}</w:t>
+      </w:r>
+      <w:r>
+        <w:t xml:space="preserve">{% </w:t>
       </w:r>
       <w:r>
         <w:rPr>
@@ -3410,7 +2329,6 @@
       <w:r>
         <w:t xml:space="preserve">{% if </w:t>
       </w:r>
-      <w:proofErr w:type="spellStart"/>
       <w:r>
         <w:t>first_witness</w:t>
       </w:r>
@@ -3420,7 +2338,6 @@
       <w:r>
         <w:t>known</w:t>
       </w:r>
-      <w:proofErr w:type="spellEnd"/>
       <w:r>
         <w:t xml:space="preserve"> </w:t>
       </w:r>
@@ -3460,24 +2377,16 @@
         </w:rPr>
         <w:t>.</w:t>
       </w:r>
-      <w:proofErr w:type="spellStart"/>
       <w:r>
         <w:rPr>
           <w:noProof/>
         </w:rPr>
-        <w:t>name_full</w:t>
-      </w:r>
-      <w:proofErr w:type="spellEnd"/>
+        <w:t>name_full()</w:t>
+      </w:r>
       <w:r>
         <w:rPr>
           <w:noProof/>
         </w:rPr>
-        <w:t>()</w:t>
-      </w:r>
-      <w:r>
-        <w:rPr>
-          <w:noProof/>
-        </w:rPr>
         <w:t>}}{% endif %}</w:t>
       </w:r>
       <w:r>
@@ -3489,13 +2398,8 @@
       <w:r>
         <w:t>users[0].</w:t>
       </w:r>
-      <w:proofErr w:type="spellStart"/>
-      <w:r>
-        <w:t>name_full</w:t>
-      </w:r>
-      <w:proofErr w:type="spellEnd"/>
-      <w:r>
-        <w:t>()</w:t>
+      <w:r>
+        <w:t>name_full()</w:t>
       </w:r>
       <w:r>
         <w:t>}}</w:t>
@@ -3503,70 +2407,52 @@
       <w:r>
         <w:t xml:space="preserve">{% if </w:t>
       </w:r>
-      <w:proofErr w:type="spellStart"/>
-      <w:r>
-        <w:t>joint_language</w:t>
-      </w:r>
-      <w:proofErr w:type="spellEnd"/>
+      <w:r>
+        <w:t xml:space="preserve">joint_language </w:t>
+      </w:r>
+      <w:r>
+        <w:t>=</w:t>
+      </w:r>
+      <w:r>
+        <w:t xml:space="preserve">= </w:t>
+      </w:r>
+      <w:r>
+        <w:t>True %} and {{</w:t>
+      </w:r>
+      <w:r>
+        <w:t>joint_owner</w:t>
+      </w:r>
+      <w:r>
+        <w:t>.</w:t>
+      </w:r>
+      <w:r>
+        <w:t>name_full()</w:t>
+      </w:r>
+      <w:r>
+        <w:t>}}</w:t>
+      </w:r>
+      <w:r>
+        <w:t>{% endif %}</w:t>
+      </w:r>
+      <w:r>
+        <w:t xml:space="preserve">, </w:t>
+      </w:r>
+      <w:r>
+        <w:t xml:space="preserve">the </w:t>
+      </w:r>
+      <w:r>
+        <w:t>{{owner_or_owners}}</w:t>
+      </w:r>
+      <w:r>
+        <w:t xml:space="preserve"> of the </w:t>
+      </w:r>
+      <w:r>
+        <w:t>above mentioned property,</w:t>
+      </w:r>
       <w:r>
         <w:t xml:space="preserve"> </w:t>
       </w:r>
       <w:r>
-        <w:t>=</w:t>
-      </w:r>
-      <w:r>
-        <w:t xml:space="preserve">= </w:t>
-      </w:r>
-      <w:r>
-        <w:t>True %} and {{</w:t>
-      </w:r>
-      <w:proofErr w:type="spellStart"/>
-      <w:r>
-        <w:t>joint_owner</w:t>
-      </w:r>
-      <w:r>
-        <w:t>.</w:t>
-      </w:r>
-      <w:r>
-        <w:t>name_full</w:t>
-      </w:r>
-      <w:proofErr w:type="spellEnd"/>
-      <w:r>
-        <w:t>()</w:t>
-      </w:r>
-      <w:r>
-        <w:t>}}</w:t>
-      </w:r>
-      <w:r>
-        <w:t>{% endif %}</w:t>
-      </w:r>
-      <w:r>
-        <w:t xml:space="preserve">, </w:t>
-      </w:r>
-      <w:r>
-        <w:t xml:space="preserve">the </w:t>
-      </w:r>
-      <w:r>
-        <w:t>{{</w:t>
-      </w:r>
-      <w:proofErr w:type="spellStart"/>
-      <w:r>
-        <w:t>owner_or_owners</w:t>
-      </w:r>
-      <w:proofErr w:type="spellEnd"/>
-      <w:r>
-        <w:t>}}</w:t>
-      </w:r>
-      <w:r>
-        <w:t xml:space="preserve"> of the </w:t>
-      </w:r>
-      <w:r>
-        <w:t>above mentioned property,</w:t>
-      </w:r>
-      <w:r>
-        <w:t xml:space="preserve"> </w:t>
-      </w:r>
-      <w:r>
         <w:t>executed this Illinois Transfer on Death In</w:t>
       </w:r>
       <w:r>
@@ -3576,37 +2462,13 @@
         <w:t xml:space="preserve">. This instrument was executed as a free and voluntary act by the </w:t>
       </w:r>
       <w:r>
-        <w:t>{{</w:t>
-      </w:r>
-      <w:proofErr w:type="spellStart"/>
-      <w:r>
-        <w:t>owner_or_</w:t>
-      </w:r>
-      <w:proofErr w:type="gramStart"/>
-      <w:r>
-        <w:t>owners</w:t>
-      </w:r>
-      <w:proofErr w:type="spellEnd"/>
-      <w:r>
-        <w:t>}}</w:t>
-      </w:r>
-      <w:r>
-        <w:t>.</w:t>
-      </w:r>
-      <w:proofErr w:type="gramEnd"/>
-      <w:r>
-        <w:t xml:space="preserve"> At the time of the execution, I believe the </w:t>
-      </w:r>
-      <w:r>
-        <w:t>{{</w:t>
-      </w:r>
-      <w:proofErr w:type="spellStart"/>
-      <w:r>
-        <w:t>owner_or_owners</w:t>
-      </w:r>
-      <w:proofErr w:type="spellEnd"/>
-      <w:r>
-        <w:t>}}</w:t>
+        <w:t>{{owner_or_owners}}</w:t>
+      </w:r>
+      <w:r>
+        <w:t xml:space="preserve">. At the time of the execution, I believe the </w:t>
+      </w:r>
+      <w:r>
+        <w:t>{{owner_or_owners}}</w:t>
       </w:r>
       <w:r>
         <w:t xml:space="preserve"> to be of sound mind and memory.</w:t>
@@ -3779,7 +2641,6 @@
             <w:r>
               <w:t xml:space="preserve">{% if </w:t>
             </w:r>
-            <w:proofErr w:type="spellStart"/>
             <w:r>
               <w:t>first_witness</w:t>
             </w:r>
@@ -3787,24 +2648,11 @@
               <w:t>_</w:t>
             </w:r>
             <w:r>
-              <w:t>known</w:t>
-            </w:r>
-            <w:proofErr w:type="spellEnd"/>
-            <w:r>
-              <w:t xml:space="preserve"> == True </w:t>
-            </w:r>
-            <w:proofErr w:type="gramStart"/>
-            <w:r>
-              <w:t>%}</w:t>
-            </w:r>
-            <w:r>
-              <w:t>{</w:t>
-            </w:r>
-            <w:proofErr w:type="gramEnd"/>
-            <w:r>
-              <w:t xml:space="preserve">% if </w:t>
-            </w:r>
-            <w:proofErr w:type="spellStart"/>
+              <w:t>known == True %}</w:t>
+            </w:r>
+            <w:r>
+              <w:t xml:space="preserve">{% if </w:t>
+            </w:r>
             <w:r>
               <w:t>first_witness</w:t>
             </w:r>
@@ -3812,44 +2660,16 @@
               <w:t>_address</w:t>
             </w:r>
             <w:r>
-              <w:t>_known</w:t>
-            </w:r>
-            <w:proofErr w:type="spellEnd"/>
-            <w:r>
-              <w:t xml:space="preserve"> == True </w:t>
-            </w:r>
-            <w:proofErr w:type="gramStart"/>
-            <w:r>
-              <w:t>%}</w:t>
+              <w:t>_known == True %}</w:t>
             </w:r>
             <w:r>
               <w:t>{{</w:t>
             </w:r>
             <w:r>
-              <w:t xml:space="preserve"> witnesses</w:t>
-            </w:r>
-            <w:proofErr w:type="gramEnd"/>
-            <w:r>
-              <w:t>[0</w:t>
-            </w:r>
-            <w:proofErr w:type="gramStart"/>
-            <w:r>
-              <w:t>]</w:t>
-            </w:r>
-            <w:r>
-              <w:t>.</w:t>
-            </w:r>
-            <w:proofErr w:type="spellStart"/>
-            <w:r>
-              <w:t>address</w:t>
-            </w:r>
-            <w:proofErr w:type="gramEnd"/>
-            <w:r>
-              <w:t>.line_one</w:t>
-            </w:r>
-            <w:proofErr w:type="spellEnd"/>
-            <w:r>
-              <w:t>(</w:t>
+              <w:t xml:space="preserve"> witnesses[0]</w:t>
+            </w:r>
+            <w:r>
+              <w:t>.address.line_one(</w:t>
             </w:r>
             <w:r>
               <w:rPr>
@@ -3858,29 +2678,13 @@
               <w:t>bare=True</w:t>
             </w:r>
             <w:r>
-              <w:t>)</w:t>
-            </w:r>
-            <w:proofErr w:type="gramStart"/>
-            <w:r>
-              <w:t>}}</w:t>
-            </w:r>
-            <w:r>
-              <w:t>{</w:t>
-            </w:r>
-            <w:proofErr w:type="gramEnd"/>
-            <w:r>
-              <w:t xml:space="preserve">% </w:t>
-            </w:r>
-            <w:proofErr w:type="gramStart"/>
-            <w:r>
-              <w:t>endif %}</w:t>
-            </w:r>
-            <w:r>
-              <w:t xml:space="preserve"> {</w:t>
-            </w:r>
-            <w:proofErr w:type="gramEnd"/>
-            <w:r>
-              <w:t>% endif %}</w:t>
+              <w:t>)}}</w:t>
+            </w:r>
+            <w:r>
+              <w:t>{% endif %}</w:t>
+            </w:r>
+            <w:r>
+              <w:t xml:space="preserve"> {% endif %}</w:t>
             </w:r>
           </w:p>
         </w:tc>
@@ -3916,7 +2720,6 @@
             <w:r>
               <w:t xml:space="preserve">{% if </w:t>
             </w:r>
-            <w:proofErr w:type="spellStart"/>
             <w:r>
               <w:t>first_witness</w:t>
             </w:r>
@@ -3924,55 +2727,25 @@
               <w:t>_</w:t>
             </w:r>
             <w:r>
-              <w:t>known</w:t>
-            </w:r>
-            <w:proofErr w:type="spellEnd"/>
-            <w:r>
-              <w:t xml:space="preserve"> == True </w:t>
-            </w:r>
-            <w:proofErr w:type="gramStart"/>
-            <w:r>
-              <w:t>%}</w:t>
+              <w:t>known == True %}</w:t>
             </w:r>
             <w:r>
               <w:t>{{</w:t>
             </w:r>
             <w:r>
-              <w:t xml:space="preserve"> witnesses</w:t>
-            </w:r>
-            <w:proofErr w:type="gramEnd"/>
-            <w:r>
-              <w:t>[0]</w:t>
+              <w:t xml:space="preserve"> witnesses[0]</w:t>
             </w:r>
             <w:r>
               <w:t>.</w:t>
             </w:r>
-            <w:proofErr w:type="spellStart"/>
-            <w:r>
-              <w:t>name_</w:t>
-            </w:r>
-            <w:proofErr w:type="gramStart"/>
-            <w:r>
-              <w:t>full</w:t>
-            </w:r>
-            <w:proofErr w:type="spellEnd"/>
-            <w:r>
-              <w:t>(</w:t>
-            </w:r>
-            <w:proofErr w:type="gramEnd"/>
-            <w:r>
-              <w:t>)</w:t>
-            </w:r>
-            <w:proofErr w:type="gramStart"/>
+            <w:r>
+              <w:t>name_full()</w:t>
+            </w:r>
             <w:r>
               <w:t>}}</w:t>
             </w:r>
             <w:r>
-              <w:t>{</w:t>
-            </w:r>
-            <w:proofErr w:type="gramEnd"/>
-            <w:r>
-              <w:t>% endif %}</w:t>
+              <w:t>{% endif %}</w:t>
             </w:r>
           </w:p>
         </w:tc>
@@ -4003,7 +2776,6 @@
             <w:r>
               <w:t xml:space="preserve">{% if </w:t>
             </w:r>
-            <w:proofErr w:type="spellStart"/>
             <w:r>
               <w:t>first_witness</w:t>
             </w:r>
@@ -4011,24 +2783,11 @@
               <w:t>_</w:t>
             </w:r>
             <w:r>
-              <w:t>known</w:t>
-            </w:r>
-            <w:proofErr w:type="spellEnd"/>
-            <w:r>
-              <w:t xml:space="preserve"> == True </w:t>
-            </w:r>
-            <w:proofErr w:type="gramStart"/>
-            <w:r>
-              <w:t>%}</w:t>
-            </w:r>
-            <w:r>
-              <w:t>{</w:t>
-            </w:r>
-            <w:proofErr w:type="gramEnd"/>
-            <w:r>
-              <w:t xml:space="preserve">% if </w:t>
-            </w:r>
-            <w:proofErr w:type="spellStart"/>
+              <w:t>known == True %}</w:t>
+            </w:r>
+            <w:r>
+              <w:t xml:space="preserve">{% if </w:t>
+            </w:r>
             <w:r>
               <w:t>first_witness</w:t>
             </w:r>
@@ -4036,65 +2795,20 @@
               <w:t>_address</w:t>
             </w:r>
             <w:r>
-              <w:t>_known</w:t>
-            </w:r>
-            <w:proofErr w:type="spellEnd"/>
-            <w:r>
-              <w:t xml:space="preserve"> == True </w:t>
-            </w:r>
-            <w:proofErr w:type="gramStart"/>
-            <w:r>
-              <w:t>%}</w:t>
+              <w:t>_known == True %}</w:t>
             </w:r>
             <w:r>
               <w:t>{{</w:t>
             </w:r>
             <w:r>
-              <w:t xml:space="preserve"> witnesses</w:t>
-            </w:r>
-            <w:proofErr w:type="gramEnd"/>
-            <w:r>
-              <w:t>[0</w:t>
-            </w:r>
-            <w:proofErr w:type="gramStart"/>
-            <w:r>
-              <w:t>]</w:t>
-            </w:r>
-            <w:r>
-              <w:t>.</w:t>
-            </w:r>
-            <w:proofErr w:type="spellStart"/>
-            <w:r>
-              <w:t>address</w:t>
-            </w:r>
-            <w:proofErr w:type="gramEnd"/>
-            <w:r>
-              <w:t>.line_</w:t>
-            </w:r>
-            <w:proofErr w:type="gramStart"/>
-            <w:r>
-              <w:t>two</w:t>
-            </w:r>
-            <w:proofErr w:type="spellEnd"/>
-            <w:r>
-              <w:t>(</w:t>
-            </w:r>
-            <w:proofErr w:type="gramEnd"/>
-            <w:r>
-              <w:t>)</w:t>
-            </w:r>
-            <w:proofErr w:type="gramStart"/>
-            <w:r>
-              <w:t>}}</w:t>
-            </w:r>
-            <w:r>
-              <w:t>{</w:t>
-            </w:r>
-            <w:proofErr w:type="gramEnd"/>
-            <w:r>
-              <w:t xml:space="preserve">% endif </w:t>
-            </w:r>
-            <w:proofErr w:type="gramStart"/>
+              <w:t xml:space="preserve"> witnesses[0]</w:t>
+            </w:r>
+            <w:r>
+              <w:t>.address.line_two()}}</w:t>
+            </w:r>
+            <w:r>
+              <w:t xml:space="preserve">{% endif </w:t>
+            </w:r>
             <w:r>
               <w:t>%</w:t>
             </w:r>
@@ -4102,11 +2816,7 @@
               <w:t>}</w:t>
             </w:r>
             <w:r>
-              <w:t>{</w:t>
-            </w:r>
-            <w:proofErr w:type="gramEnd"/>
-            <w:r>
-              <w:t>% endif %}</w:t>
+              <w:t>{% endif %}</w:t>
             </w:r>
           </w:p>
         </w:tc>
@@ -4122,18 +2832,10 @@
     </w:p>
     <w:p>
       <w:r>
-        <w:t xml:space="preserve">I, {% if </w:t>
-      </w:r>
-      <w:proofErr w:type="spellStart"/>
-      <w:r>
-        <w:t>second_witness_</w:t>
-      </w:r>
-      <w:r>
-        <w:t>known</w:t>
-      </w:r>
-      <w:proofErr w:type="spellEnd"/>
-      <w:r>
-        <w:t>== False %}</w:t>
+        <w:t>I, {% if second_witness_</w:t>
+      </w:r>
+      <w:r>
+        <w:t>known== False %}</w:t>
       </w:r>
       <w:r>
         <w:t>____________________</w:t>
@@ -4162,24 +2864,16 @@
         </w:rPr>
         <w:t>.</w:t>
       </w:r>
-      <w:proofErr w:type="spellStart"/>
       <w:r>
         <w:rPr>
           <w:noProof/>
         </w:rPr>
-        <w:t>name_full</w:t>
-      </w:r>
-      <w:proofErr w:type="spellEnd"/>
+        <w:t>name_full()</w:t>
+      </w:r>
       <w:r>
         <w:rPr>
           <w:noProof/>
         </w:rPr>
-        <w:t>()</w:t>
-      </w:r>
-      <w:r>
-        <w:rPr>
-          <w:noProof/>
-        </w:rPr>
         <w:t>}}{% endif %}</w:t>
       </w:r>
       <w:r>
@@ -4191,13 +2885,8 @@
       <w:r>
         <w:t>users[0].</w:t>
       </w:r>
-      <w:proofErr w:type="spellStart"/>
-      <w:r>
-        <w:t>name_full</w:t>
-      </w:r>
-      <w:proofErr w:type="spellEnd"/>
-      <w:r>
-        <w:t>()</w:t>
+      <w:r>
+        <w:t>name_full()</w:t>
       </w:r>
       <w:r>
         <w:t>}}</w:t>
@@ -4205,13 +2894,8 @@
       <w:r>
         <w:t xml:space="preserve">{% if </w:t>
       </w:r>
-      <w:proofErr w:type="spellStart"/>
-      <w:r>
-        <w:t>joint_language</w:t>
-      </w:r>
-      <w:proofErr w:type="spellEnd"/>
-      <w:r>
-        <w:t xml:space="preserve"> </w:t>
+      <w:r>
+        <w:t xml:space="preserve">joint_language </w:t>
       </w:r>
       <w:r>
         <w:t>=</w:t>
@@ -4222,7 +2906,6 @@
       <w:r>
         <w:t>True %} and {{</w:t>
       </w:r>
-      <w:proofErr w:type="spellStart"/>
       <w:r>
         <w:t>joint_owner</w:t>
       </w:r>
@@ -4230,11 +2913,7 @@
         <w:t>.</w:t>
       </w:r>
       <w:r>
-        <w:t>name_full</w:t>
-      </w:r>
-      <w:proofErr w:type="spellEnd"/>
-      <w:r>
-        <w:t>()</w:t>
+        <w:t>name_full()</w:t>
       </w:r>
       <w:r>
         <w:t xml:space="preserve">}}{% endif %}, </w:t>
@@ -4243,15 +2922,7 @@
         <w:t xml:space="preserve">the </w:t>
       </w:r>
       <w:r>
-        <w:t>{{</w:t>
-      </w:r>
-      <w:proofErr w:type="spellStart"/>
-      <w:r>
-        <w:t>owner_or_owners</w:t>
-      </w:r>
-      <w:proofErr w:type="spellEnd"/>
-      <w:r>
-        <w:t>}}</w:t>
+        <w:t>{{owner_or_owners}}</w:t>
       </w:r>
       <w:r>
         <w:t xml:space="preserve"> of the </w:t>
@@ -4263,31 +2934,7 @@
         <w:t xml:space="preserve">, </w:t>
       </w:r>
       <w:r>
-        <w:t>executed this Illinois Transfer on Death Instrument in my presence on _________________. This instrument was executed as a free and voluntary act by the {{</w:t>
-      </w:r>
-      <w:proofErr w:type="spellStart"/>
-      <w:r>
-        <w:t>owner_or_</w:t>
-      </w:r>
-      <w:proofErr w:type="gramStart"/>
-      <w:r>
-        <w:t>owners</w:t>
-      </w:r>
-      <w:proofErr w:type="spellEnd"/>
-      <w:r>
-        <w:t>}}.</w:t>
-      </w:r>
-      <w:proofErr w:type="gramEnd"/>
-      <w:r>
-        <w:t xml:space="preserve"> At the time of the execution, I believe the {{</w:t>
-      </w:r>
-      <w:proofErr w:type="spellStart"/>
-      <w:r>
-        <w:t>owner_or_owners</w:t>
-      </w:r>
-      <w:proofErr w:type="spellEnd"/>
-      <w:r>
-        <w:t>}} to be of sound mind and memory</w:t>
+        <w:t>executed this Illinois Transfer on Death Instrument in my presence on _________________. This instrument was executed as a free and voluntary act by the {{owner_or_owners}}. At the time of the execution, I believe the {{owner_or_owners}} to be of sound mind and memory</w:t>
       </w:r>
       <w:r>
         <w:t>.</w:t>
@@ -4449,74 +3096,29 @@
               <w:contextualSpacing/>
             </w:pPr>
             <w:r>
-              <w:t xml:space="preserve">{% if </w:t>
-            </w:r>
-            <w:proofErr w:type="spellStart"/>
+              <w:t>{% if second</w:t>
+            </w:r>
+            <w:r>
+              <w:t>_witness_</w:t>
+            </w:r>
+            <w:r>
+              <w:t xml:space="preserve">known == True %}{% if </w:t>
+            </w:r>
             <w:r>
               <w:t>second</w:t>
             </w:r>
             <w:r>
-              <w:t>_witness_</w:t>
-            </w:r>
-            <w:r>
-              <w:t>known</w:t>
-            </w:r>
-            <w:proofErr w:type="spellEnd"/>
-            <w:r>
-              <w:t xml:space="preserve"> == True </w:t>
-            </w:r>
-            <w:proofErr w:type="gramStart"/>
-            <w:r>
-              <w:t>%}{</w:t>
-            </w:r>
-            <w:proofErr w:type="gramEnd"/>
-            <w:r>
-              <w:t xml:space="preserve">% if </w:t>
-            </w:r>
-            <w:proofErr w:type="spellStart"/>
-            <w:r>
-              <w:t>second</w:t>
-            </w:r>
-            <w:r>
               <w:t>_witness_address</w:t>
             </w:r>
             <w:r>
-              <w:t>_known</w:t>
-            </w:r>
-            <w:proofErr w:type="spellEnd"/>
-            <w:r>
-              <w:t xml:space="preserve"> == True </w:t>
-            </w:r>
-            <w:proofErr w:type="gramStart"/>
-            <w:r>
-              <w:t xml:space="preserve">%}{{ </w:t>
+              <w:t xml:space="preserve">_known == True %}{{ </w:t>
             </w:r>
             <w:r>
               <w:lastRenderedPageBreak/>
-              <w:t>witnesses</w:t>
-            </w:r>
-            <w:proofErr w:type="gramEnd"/>
-            <w:r>
-              <w:t>[1</w:t>
-            </w:r>
-            <w:proofErr w:type="gramStart"/>
-            <w:r>
-              <w:t>]</w:t>
-            </w:r>
-            <w:r>
-              <w:t>.</w:t>
-            </w:r>
-            <w:proofErr w:type="spellStart"/>
-            <w:r>
-              <w:t>address</w:t>
-            </w:r>
-            <w:proofErr w:type="gramEnd"/>
-            <w:r>
-              <w:t>.line_one</w:t>
-            </w:r>
-            <w:proofErr w:type="spellEnd"/>
-            <w:r>
-              <w:t>(</w:t>
+              <w:t>witnesses[1]</w:t>
+            </w:r>
+            <w:r>
+              <w:t>.address.line_one(</w:t>
             </w:r>
             <w:r>
               <w:rPr>
@@ -4525,15 +3127,7 @@
               <w:t>bare=True</w:t>
             </w:r>
             <w:r>
-              <w:t>)</w:t>
-            </w:r>
-            <w:proofErr w:type="gramStart"/>
-            <w:r>
-              <w:t>}}{</w:t>
-            </w:r>
-            <w:proofErr w:type="gramEnd"/>
-            <w:r>
-              <w:t>% endif %} {% endif %}</w:t>
+              <w:t>)}}{% endif %} {% endif %}</w:t>
             </w:r>
           </w:p>
         </w:tc>
@@ -4569,11 +3163,7 @@
               <w:contextualSpacing/>
             </w:pPr>
             <w:r>
-              <w:t xml:space="preserve">{% if </w:t>
-            </w:r>
-            <w:proofErr w:type="spellStart"/>
-            <w:r>
-              <w:t>second</w:t>
+              <w:t>{% if second</w:t>
             </w:r>
             <w:r>
               <w:t>_wi</w:t>
@@ -4582,49 +3172,19 @@
               <w:t>tness_</w:t>
             </w:r>
             <w:r>
-              <w:t>known</w:t>
-            </w:r>
-            <w:proofErr w:type="spellEnd"/>
-            <w:r>
-              <w:t xml:space="preserve"> == True </w:t>
-            </w:r>
-            <w:proofErr w:type="gramStart"/>
-            <w:r>
-              <w:t xml:space="preserve">%}{{ </w:t>
-            </w:r>
-            <w:r>
-              <w:t>witnesses</w:t>
-            </w:r>
-            <w:proofErr w:type="gramEnd"/>
-            <w:r>
-              <w:t>[1]</w:t>
+              <w:t xml:space="preserve">known == True %}{{ </w:t>
+            </w:r>
+            <w:r>
+              <w:t>witnesses[1]</w:t>
             </w:r>
             <w:r>
               <w:t>.</w:t>
             </w:r>
-            <w:proofErr w:type="spellStart"/>
-            <w:r>
-              <w:t>name_</w:t>
-            </w:r>
-            <w:proofErr w:type="gramStart"/>
-            <w:r>
-              <w:t>full</w:t>
-            </w:r>
-            <w:proofErr w:type="spellEnd"/>
-            <w:r>
-              <w:t>(</w:t>
-            </w:r>
-            <w:proofErr w:type="gramEnd"/>
-            <w:r>
-              <w:t>)</w:t>
-            </w:r>
-            <w:proofErr w:type="gramStart"/>
-            <w:r>
-              <w:t>}}{</w:t>
-            </w:r>
-            <w:proofErr w:type="gramEnd"/>
-            <w:r>
-              <w:t>% endif %}</w:t>
+            <w:r>
+              <w:t>name_full()</w:t>
+            </w:r>
+            <w:r>
+              <w:t>}}{% endif %}</w:t>
             </w:r>
           </w:p>
         </w:tc>
@@ -4653,97 +3213,28 @@
               <w:contextualSpacing/>
             </w:pPr>
             <w:r>
-              <w:t xml:space="preserve">{% if </w:t>
-            </w:r>
-            <w:proofErr w:type="spellStart"/>
-            <w:r>
-              <w:t>second</w:t>
+              <w:t>{% if second</w:t>
             </w:r>
             <w:r>
               <w:t>_witness_</w:t>
             </w:r>
             <w:r>
-              <w:t>known</w:t>
-            </w:r>
-            <w:proofErr w:type="spellEnd"/>
-            <w:r>
-              <w:t xml:space="preserve"> == True </w:t>
-            </w:r>
-            <w:proofErr w:type="gramStart"/>
-            <w:r>
-              <w:t>%}{</w:t>
-            </w:r>
-            <w:proofErr w:type="gramEnd"/>
-            <w:r>
-              <w:t xml:space="preserve">% if </w:t>
-            </w:r>
-            <w:proofErr w:type="spellStart"/>
-            <w:r>
-              <w:t>second</w:t>
+              <w:t xml:space="preserve">known == True </w:t>
+            </w:r>
+            <w:r>
+              <w:t>%}{% if second</w:t>
             </w:r>
             <w:r>
               <w:t>_witness_address</w:t>
             </w:r>
             <w:r>
-              <w:t>_known</w:t>
-            </w:r>
-            <w:proofErr w:type="spellEnd"/>
-            <w:r>
-              <w:t xml:space="preserve"> == True </w:t>
-            </w:r>
-            <w:proofErr w:type="gramStart"/>
-            <w:r>
-              <w:t xml:space="preserve">%}{{ </w:t>
-            </w:r>
-            <w:r>
-              <w:t>witnesses</w:t>
-            </w:r>
-            <w:proofErr w:type="gramEnd"/>
-            <w:r>
-              <w:t>[1</w:t>
-            </w:r>
-            <w:proofErr w:type="gramStart"/>
-            <w:r>
-              <w:t>]</w:t>
-            </w:r>
-            <w:r>
-              <w:t>.</w:t>
-            </w:r>
-            <w:proofErr w:type="spellStart"/>
-            <w:r>
-              <w:t>address</w:t>
-            </w:r>
-            <w:proofErr w:type="gramEnd"/>
-            <w:r>
-              <w:t>.line_</w:t>
-            </w:r>
-            <w:proofErr w:type="gramStart"/>
-            <w:r>
-              <w:t>two</w:t>
-            </w:r>
-            <w:proofErr w:type="spellEnd"/>
-            <w:r>
-              <w:t>(</w:t>
-            </w:r>
-            <w:proofErr w:type="gramEnd"/>
-            <w:r>
-              <w:t>)</w:t>
-            </w:r>
-            <w:proofErr w:type="gramStart"/>
-            <w:r>
-              <w:t>}}{</w:t>
-            </w:r>
-            <w:proofErr w:type="gramEnd"/>
-            <w:r>
-              <w:t xml:space="preserve">% endif </w:t>
-            </w:r>
-            <w:proofErr w:type="gramStart"/>
-            <w:r>
-              <w:t>%}{</w:t>
-            </w:r>
-            <w:proofErr w:type="gramEnd"/>
-            <w:r>
-              <w:t>% endif %}</w:t>
+              <w:t xml:space="preserve">_known == True %}{{ </w:t>
+            </w:r>
+            <w:r>
+              <w:t>witnesses[1]</w:t>
+            </w:r>
+            <w:r>
+              <w:t>.address.line_two()}}{% endif %}{% endif %}</w:t>
             </w:r>
           </w:p>
         </w:tc>
@@ -4813,198 +3304,142 @@
         </w:rPr>
         <w:t>users[0].</w:t>
       </w:r>
-      <w:proofErr w:type="spellStart"/>
       <w:r>
         <w:rPr>
           <w:bCs/>
         </w:rPr>
-        <w:t>name_full</w:t>
-      </w:r>
-      <w:proofErr w:type="spellEnd"/>
+        <w:t>name_full()</w:t>
+      </w:r>
       <w:r>
         <w:rPr>
           <w:bCs/>
         </w:rPr>
-        <w:t>()</w:t>
+        <w:t>}}</w:t>
       </w:r>
       <w:r>
         <w:rPr>
           <w:bCs/>
         </w:rPr>
+        <w:t>{</w:t>
+      </w:r>
+      <w:r>
+        <w:t xml:space="preserve">% if </w:t>
+      </w:r>
+      <w:r>
+        <w:t>joint_language =</w:t>
+      </w:r>
+      <w:r>
+        <w:t>=</w:t>
+      </w:r>
+      <w:r>
+        <w:t xml:space="preserve"> </w:t>
+      </w:r>
+      <w:r>
+        <w:t>True %} and {{</w:t>
+      </w:r>
+      <w:r>
+        <w:t>joint_owner</w:t>
+      </w:r>
+      <w:r>
+        <w:t>.</w:t>
+      </w:r>
+      <w:r>
+        <w:t>name_full()</w:t>
+      </w:r>
+      <w:r>
+        <w:t>}}{% endif %}</w:t>
+      </w:r>
+      <w:r>
+        <w:t>,</w:t>
+      </w:r>
+      <w:r>
+        <w:t xml:space="preserve"> known to me to be the same </w:t>
+      </w:r>
+      <w:r>
+        <w:t>{{person_or_persons}}</w:t>
+      </w:r>
+      <w:r>
+        <w:t xml:space="preserve"> whose </w:t>
+      </w:r>
+      <w:r>
+        <w:t>{{</w:t>
+      </w:r>
+      <w:r>
+        <w:t>name_is_or_names_are</w:t>
+      </w:r>
+      <w:r>
         <w:t>}}</w:t>
       </w:r>
       <w:r>
-        <w:rPr>
-          <w:bCs/>
-        </w:rPr>
-        <w:t>{</w:t>
-      </w:r>
-      <w:r>
-        <w:t xml:space="preserve">% if </w:t>
-      </w:r>
-      <w:proofErr w:type="spellStart"/>
-      <w:r>
-        <w:t>joint_language</w:t>
-      </w:r>
-      <w:proofErr w:type="spellEnd"/>
-      <w:r>
-        <w:t xml:space="preserve"> =</w:t>
-      </w:r>
-      <w:r>
-        <w:t>=</w:t>
+        <w:t xml:space="preserve"> subscribed as the </w:t>
+      </w:r>
+      <w:r>
+        <w:t>{{owner_or_owners}}</w:t>
+      </w:r>
+      <w:r>
+        <w:t xml:space="preserve"> of the real estate, appea</w:t>
+      </w:r>
+      <w:r>
+        <w:t xml:space="preserve">red before me and the witnesses {% if </w:t>
+      </w:r>
+      <w:r>
+        <w:t>second_witness_</w:t>
+      </w:r>
+      <w:r>
+        <w:t xml:space="preserve">known == True </w:t>
+      </w:r>
+      <w:r>
+        <w:t>%}{{</w:t>
       </w:r>
       <w:r>
         <w:t xml:space="preserve"> </w:t>
       </w:r>
       <w:r>
-        <w:t>True %} and {{</w:t>
-      </w:r>
-      <w:proofErr w:type="spellStart"/>
-      <w:r>
-        <w:t>joint_owner</w:t>
+        <w:t>witnesses[0]</w:t>
       </w:r>
       <w:r>
         <w:t>.</w:t>
       </w:r>
       <w:r>
-        <w:t>name_full</w:t>
-      </w:r>
-      <w:proofErr w:type="spellEnd"/>
-      <w:r>
-        <w:t>()</w:t>
-      </w:r>
-      <w:r>
-        <w:t>}}{% endif %}</w:t>
-      </w:r>
-      <w:r>
-        <w:t>,</w:t>
-      </w:r>
-      <w:r>
-        <w:t xml:space="preserve"> known to me to be the same </w:t>
+        <w:t>name_full()</w:t>
+      </w:r>
+      <w:r>
+        <w:t xml:space="preserve">}} and </w:t>
       </w:r>
       <w:r>
         <w:t>{{</w:t>
       </w:r>
-      <w:proofErr w:type="spellStart"/>
-      <w:r>
-        <w:t>person_or_persons</w:t>
-      </w:r>
-      <w:proofErr w:type="spellEnd"/>
+      <w:r>
+        <w:t xml:space="preserve"> </w:t>
+      </w:r>
+      <w:r>
+        <w:t>witnesses[1]</w:t>
+      </w:r>
+      <w:r>
+        <w:t>.</w:t>
+      </w:r>
+      <w:r>
+        <w:t>name_full()</w:t>
+      </w:r>
+      <w:r>
+        <w:t xml:space="preserve">}}{% else %} </w:t>
+      </w:r>
+      <w:r>
+        <w:t>{{</w:t>
+      </w:r>
+      <w:r>
+        <w:t>witnesses[0]</w:t>
+      </w:r>
+      <w:r>
+        <w:t>.</w:t>
+      </w:r>
+      <w:r>
+        <w:t>name_full()</w:t>
+      </w:r>
       <w:r>
         <w:t>}}</w:t>
       </w:r>
       <w:r>
-        <w:t xml:space="preserve"> whose </w:t>
-      </w:r>
-      <w:r>
-        <w:t>{{</w:t>
-      </w:r>
-      <w:proofErr w:type="spellStart"/>
-      <w:r>
-        <w:t>name_is_or_names_are</w:t>
-      </w:r>
-      <w:proofErr w:type="spellEnd"/>
-      <w:r>
-        <w:t>}}</w:t>
-      </w:r>
-      <w:r>
-        <w:t xml:space="preserve"> subscribed as the </w:t>
-      </w:r>
-      <w:r>
-        <w:t>{{</w:t>
-      </w:r>
-      <w:proofErr w:type="spellStart"/>
-      <w:r>
-        <w:t>owner_or_owners</w:t>
-      </w:r>
-      <w:proofErr w:type="spellEnd"/>
-      <w:r>
-        <w:t>}}</w:t>
-      </w:r>
-      <w:r>
-        <w:t xml:space="preserve"> of the real estate, appea</w:t>
-      </w:r>
-      <w:r>
-        <w:t xml:space="preserve">red before me and the witnesses {% if </w:t>
-      </w:r>
-      <w:proofErr w:type="spellStart"/>
-      <w:r>
-        <w:t>second_witness_</w:t>
-      </w:r>
-      <w:r>
-        <w:t>known</w:t>
-      </w:r>
-      <w:proofErr w:type="spellEnd"/>
-      <w:r>
-        <w:t xml:space="preserve"> == True </w:t>
-      </w:r>
-      <w:r>
-        <w:t>%}{{</w:t>
-      </w:r>
-      <w:r>
-        <w:t xml:space="preserve"> </w:t>
-      </w:r>
-      <w:r>
-        <w:t>witnesses[0]</w:t>
-      </w:r>
-      <w:r>
-        <w:t>.</w:t>
-      </w:r>
-      <w:proofErr w:type="spellStart"/>
-      <w:r>
-        <w:t>name_full</w:t>
-      </w:r>
-      <w:proofErr w:type="spellEnd"/>
-      <w:r>
-        <w:t>()</w:t>
-      </w:r>
-      <w:r>
-        <w:t xml:space="preserve">}} and </w:t>
-      </w:r>
-      <w:r>
-        <w:t>{{</w:t>
-      </w:r>
-      <w:r>
-        <w:t xml:space="preserve"> </w:t>
-      </w:r>
-      <w:r>
-        <w:t>witnesses[1]</w:t>
-      </w:r>
-      <w:r>
-        <w:t>.</w:t>
-      </w:r>
-      <w:proofErr w:type="spellStart"/>
-      <w:r>
-        <w:t>name_full</w:t>
-      </w:r>
-      <w:proofErr w:type="spellEnd"/>
-      <w:r>
-        <w:t>()</w:t>
-      </w:r>
-      <w:r>
-        <w:t xml:space="preserve">}}{% else %} </w:t>
-      </w:r>
-      <w:r>
-        <w:t>{{</w:t>
-      </w:r>
-      <w:r>
-        <w:t>witnesses[0]</w:t>
-      </w:r>
-      <w:r>
-        <w:t>.</w:t>
-      </w:r>
-      <w:proofErr w:type="spellStart"/>
-      <w:r>
-        <w:t>name_full</w:t>
-      </w:r>
-      <w:proofErr w:type="spellEnd"/>
-      <w:r>
-        <w:t>()</w:t>
-      </w:r>
-      <w:r>
-        <w:t>}}</w:t>
-      </w:r>
-      <w:r>
         <w:t xml:space="preserve"> and __________________________</w:t>
       </w:r>
       <w:r>
@@ -5014,15 +3449,7 @@
         <w:t xml:space="preserve">in person and acknowledged signing the instrument as the free and voluntary act of the </w:t>
       </w:r>
       <w:r>
-        <w:t>{{</w:t>
-      </w:r>
-      <w:proofErr w:type="spellStart"/>
-      <w:r>
-        <w:t>owner_or_owners</w:t>
-      </w:r>
-      <w:proofErr w:type="spellEnd"/>
-      <w:r>
-        <w:t>}}</w:t>
+        <w:t>{{owner_or_owners}}</w:t>
       </w:r>
       <w:r>
         <w:t xml:space="preserve"> who was acting of sound mind and memory for the uses and purposes therein set forth. </w:t>
@@ -5074,13 +3501,8 @@
       <w:r>
         <w:t>users[0].</w:t>
       </w:r>
-      <w:proofErr w:type="spellStart"/>
-      <w:r>
-        <w:t>name_full</w:t>
-      </w:r>
-      <w:proofErr w:type="spellEnd"/>
-      <w:r>
-        <w:t>()</w:t>
+      <w:r>
+        <w:t>name_full()</w:t>
       </w:r>
       <w:r>
         <w:t>}}</w:t>
@@ -5088,13 +3510,8 @@
       <w:r>
         <w:t xml:space="preserve">{% if </w:t>
       </w:r>
-      <w:proofErr w:type="spellStart"/>
-      <w:r>
-        <w:t>joint_language</w:t>
-      </w:r>
-      <w:proofErr w:type="spellEnd"/>
-      <w:r>
-        <w:t xml:space="preserve"> =</w:t>
+      <w:r>
+        <w:t>joint_language =</w:t>
       </w:r>
       <w:r>
         <w:t>=</w:t>
@@ -5103,18 +3520,10 @@
         <w:t xml:space="preserve"> </w:t>
       </w:r>
       <w:r>
-        <w:t>True %} and {{</w:t>
-      </w:r>
-      <w:proofErr w:type="spellStart"/>
-      <w:r>
-        <w:t>joint_owner.</w:t>
-      </w:r>
-      <w:r>
-        <w:t>name_full</w:t>
-      </w:r>
-      <w:proofErr w:type="spellEnd"/>
-      <w:r>
-        <w:t>()</w:t>
+        <w:t>True %} and {{joint_owner.</w:t>
+      </w:r>
+      <w:r>
+        <w:t>name_full()</w:t>
       </w:r>
       <w:r>
         <w:t xml:space="preserve">}}{% endif %}, </w:t>
@@ -5123,15 +3532,7 @@
         <w:t xml:space="preserve">the </w:t>
       </w:r>
       <w:r>
-        <w:t>{{</w:t>
-      </w:r>
-      <w:proofErr w:type="spellStart"/>
-      <w:r>
-        <w:t>owner_or_owners</w:t>
-      </w:r>
-      <w:proofErr w:type="spellEnd"/>
-      <w:r>
-        <w:t>}}</w:t>
+        <w:t>{{owner_or_owners}}</w:t>
       </w:r>
       <w:r>
         <w:t xml:space="preserve"> of the </w:t>
@@ -5161,31 +3562,7 @@
         <w:t xml:space="preserve">instrument was executed as a </w:t>
       </w:r>
       <w:r>
-        <w:t>free and voluntary act by the {{</w:t>
-      </w:r>
-      <w:proofErr w:type="spellStart"/>
-      <w:r>
-        <w:t>owner_or_</w:t>
-      </w:r>
-      <w:proofErr w:type="gramStart"/>
-      <w:r>
-        <w:t>owners</w:t>
-      </w:r>
-      <w:proofErr w:type="spellEnd"/>
-      <w:r>
-        <w:t>}}.</w:t>
-      </w:r>
-      <w:proofErr w:type="gramEnd"/>
-      <w:r>
-        <w:t xml:space="preserve"> At the time of the execution, I believe the {{</w:t>
-      </w:r>
-      <w:proofErr w:type="spellStart"/>
-      <w:r>
-        <w:t>owner_or_owners</w:t>
-      </w:r>
-      <w:proofErr w:type="spellEnd"/>
-      <w:r>
-        <w:t>}} to be of sound mind</w:t>
+        <w:t>free and voluntary act by the {{owner_or_owners}}. At the time of the execution, I believe the {{owner_or_owners}} to be of sound mind</w:t>
       </w:r>
       <w:r>
         <w:t xml:space="preserve"> and memory.</w:t>
@@ -5413,13 +3790,8 @@
       <w:r>
         <w:t>users[0].</w:t>
       </w:r>
-      <w:proofErr w:type="spellStart"/>
-      <w:r>
-        <w:t>name_full</w:t>
-      </w:r>
-      <w:proofErr w:type="spellEnd"/>
-      <w:r>
-        <w:t>()</w:t>
+      <w:r>
+        <w:t>name_full()</w:t>
       </w:r>
       <w:r>
         <w:t>}}</w:t>
@@ -5427,13 +3799,8 @@
       <w:r>
         <w:t xml:space="preserve">{% if </w:t>
       </w:r>
-      <w:proofErr w:type="spellStart"/>
-      <w:r>
-        <w:t>joint_language</w:t>
-      </w:r>
-      <w:proofErr w:type="spellEnd"/>
-      <w:r>
-        <w:t xml:space="preserve"> =</w:t>
+      <w:r>
+        <w:t>joint_language =</w:t>
       </w:r>
       <w:r>
         <w:t>=</w:t>
@@ -5442,18 +3809,10 @@
         <w:t xml:space="preserve"> </w:t>
       </w:r>
       <w:r>
-        <w:t>True %} and {{</w:t>
-      </w:r>
-      <w:proofErr w:type="spellStart"/>
-      <w:r>
-        <w:t>joint_owner.</w:t>
-      </w:r>
-      <w:r>
-        <w:t>name_full</w:t>
-      </w:r>
-      <w:proofErr w:type="spellEnd"/>
-      <w:r>
-        <w:t>()</w:t>
+        <w:t>True %} and {{joint_owner.</w:t>
+      </w:r>
+      <w:r>
+        <w:t>name_full()</w:t>
       </w:r>
       <w:r>
         <w:t xml:space="preserve">}}{% endif %}, </w:t>
@@ -5462,15 +3821,7 @@
         <w:t xml:space="preserve">the </w:t>
       </w:r>
       <w:r>
-        <w:t>{{</w:t>
-      </w:r>
-      <w:proofErr w:type="spellStart"/>
-      <w:r>
-        <w:t>owner_or_owners</w:t>
-      </w:r>
-      <w:proofErr w:type="spellEnd"/>
-      <w:r>
-        <w:t>}}</w:t>
+        <w:t>{{owner_or_owners}}</w:t>
       </w:r>
       <w:r>
         <w:t xml:space="preserve"> of the </w:t>
@@ -5500,31 +3851,7 @@
         <w:t xml:space="preserve">instrument was executed as a </w:t>
       </w:r>
       <w:r>
-        <w:t>free and voluntary act by the {{</w:t>
-      </w:r>
-      <w:proofErr w:type="spellStart"/>
-      <w:r>
-        <w:t>owner_or_</w:t>
-      </w:r>
-      <w:proofErr w:type="gramStart"/>
-      <w:r>
-        <w:t>owners</w:t>
-      </w:r>
-      <w:proofErr w:type="spellEnd"/>
-      <w:r>
-        <w:t>}}.</w:t>
-      </w:r>
-      <w:proofErr w:type="gramEnd"/>
-      <w:r>
-        <w:t xml:space="preserve"> At the time of the execution, I believe the {{</w:t>
-      </w:r>
-      <w:proofErr w:type="spellStart"/>
-      <w:r>
-        <w:t>owner_or_owners</w:t>
-      </w:r>
-      <w:proofErr w:type="spellEnd"/>
-      <w:r>
-        <w:t>}} to be of sound mind</w:t>
+        <w:t>free and voluntary act by the {{owner_or_owners}}. At the time of the execution, I believe the {{owner_or_owners}} to be of sound mind</w:t>
       </w:r>
       <w:r>
         <w:t xml:space="preserve"> and memory.</w:t>
@@ -5789,36 +4116,23 @@
         </w:rPr>
         <w:t>{{users[0].</w:t>
       </w:r>
-      <w:proofErr w:type="spellStart"/>
       <w:r>
         <w:rPr>
           <w:bCs/>
         </w:rPr>
-        <w:t>name_full</w:t>
-      </w:r>
-      <w:proofErr w:type="spellEnd"/>
+        <w:t>name_full()</w:t>
+      </w:r>
       <w:r>
         <w:rPr>
           <w:bCs/>
         </w:rPr>
-        <w:t>()</w:t>
-      </w:r>
-      <w:r>
-        <w:rPr>
-          <w:bCs/>
-        </w:rPr>
         <w:t>}}{</w:t>
       </w:r>
       <w:r>
         <w:t xml:space="preserve">% if </w:t>
       </w:r>
-      <w:proofErr w:type="spellStart"/>
-      <w:r>
-        <w:t>joint_language</w:t>
-      </w:r>
-      <w:proofErr w:type="spellEnd"/>
-      <w:r>
-        <w:t xml:space="preserve"> </w:t>
+      <w:r>
+        <w:t xml:space="preserve">joint_language </w:t>
       </w:r>
       <w:r>
         <w:t>=</w:t>
@@ -5829,7 +4143,6 @@
       <w:r>
         <w:t>True %} and {{</w:t>
       </w:r>
-      <w:proofErr w:type="spellStart"/>
       <w:r>
         <w:t>joint_owner</w:t>
       </w:r>
@@ -5837,11 +4150,7 @@
         <w:t>.</w:t>
       </w:r>
       <w:r>
-        <w:t>name_full</w:t>
-      </w:r>
-      <w:proofErr w:type="spellEnd"/>
-      <w:r>
-        <w:t>()</w:t>
+        <w:t>name_full()</w:t>
       </w:r>
       <w:r>
         <w:t>}}{% endif %}</w:t>
@@ -5850,52 +4159,41 @@
         <w:t>,</w:t>
       </w:r>
       <w:r>
-        <w:t xml:space="preserve"> known to me to be the same {{</w:t>
-      </w:r>
-      <w:proofErr w:type="spellStart"/>
-      <w:r>
-        <w:t>person_or_persons</w:t>
-      </w:r>
-      <w:proofErr w:type="spellEnd"/>
-      <w:r>
-        <w:t>}} whose {{</w:t>
-      </w:r>
-      <w:proofErr w:type="spellStart"/>
+        <w:t xml:space="preserve"> known to me to be the same {{person_or_persons}} whose {{</w:t>
+      </w:r>
       <w:r>
         <w:t>name_is_or_names_are</w:t>
       </w:r>
-      <w:proofErr w:type="spellEnd"/>
-      <w:r>
-        <w:t>}} subscribed as the {{</w:t>
-      </w:r>
-      <w:proofErr w:type="spellStart"/>
-      <w:r>
-        <w:t>owner_or_owners</w:t>
-      </w:r>
-      <w:proofErr w:type="spellEnd"/>
-      <w:r>
-        <w:t xml:space="preserve">}} of the </w:t>
-      </w:r>
-      <w:r>
-        <w:t xml:space="preserve">real estate, appeared before me and the witnesses and </w:t>
-      </w:r>
-      <w:r>
-        <w:t>in person and acknowledged signing the instrument as the free and voluntary act of the {{</w:t>
-      </w:r>
-      <w:proofErr w:type="spellStart"/>
-      <w:r>
-        <w:t>owner_or_owners</w:t>
-      </w:r>
-      <w:proofErr w:type="spellEnd"/>
-      <w:r>
-        <w:t>}} who was acting</w:t>
-      </w:r>
-      <w:r>
-        <w:t xml:space="preserve"> of sound mind </w:t>
+      <w:r>
+        <w:t xml:space="preserve">}} subscribed as the {{owner_or_owners}} of the </w:t>
+      </w:r>
+      <w:r>
+        <w:t xml:space="preserve">real estate, </w:t>
+      </w:r>
+      <w:r>
+        <w:t xml:space="preserve">and the witnesses, </w:t>
+      </w:r>
+      <w:r>
+        <w:t xml:space="preserve">appeared before me and and </w:t>
+      </w:r>
+      <w:r>
+        <w:t xml:space="preserve">in person and acknowledged signing the instrument as the free and voluntary act of the {{owner_or_owners}} </w:t>
+      </w:r>
+      <w:r>
+        <w:t xml:space="preserve">and witnesses </w:t>
       </w:r>
       <w:r>
         <w:lastRenderedPageBreak/>
-        <w:t xml:space="preserve">and memory for the uses and purposes therein set forth. </w:t>
+        <w:t>who w</w:t>
+      </w:r>
+      <w:r>
+        <w:t>ere</w:t>
+      </w:r>
+      <w:r>
+        <w:t xml:space="preserve"> acting</w:t>
+      </w:r>
+      <w:r>
+        <w:t xml:space="preserve"> of sound mind and memory for the uses and purposes therein set forth. </w:t>
       </w:r>
       <w:r>
         <w:t>Signed and sworn to before me this ____ day of _________________, _______.</w:t>
@@ -5924,11 +4222,7 @@
         <w:keepNext/>
       </w:pPr>
       <w:r>
-        <w:t xml:space="preserve">{% endif </w:t>
-      </w:r>
-      <w:proofErr w:type="gramStart"/>
-      <w:r>
-        <w:t>%}</w:t>
+        <w:t>{% endif %}</w:t>
       </w:r>
       <w:r>
         <w:rPr>
@@ -5936,16 +4230,15 @@
           <w:bCs/>
           <w:u w:val="single"/>
         </w:rPr>
-        <w:t>_</w:t>
-      </w:r>
-      <w:proofErr w:type="gramEnd"/>
+        <w:t>________________________________________</w:t>
+      </w:r>
       <w:r>
         <w:rPr>
           <w:b/>
           <w:bCs/>
           <w:u w:val="single"/>
         </w:rPr>
-        <w:t>_______________________________________</w:t>
+        <w:t>__________________</w:t>
       </w:r>
       <w:r>
         <w:rPr>
@@ -5953,14 +4246,6 @@
           <w:bCs/>
           <w:u w:val="single"/>
         </w:rPr>
-        <w:t>__________________</w:t>
-      </w:r>
-      <w:r>
-        <w:rPr>
-          <w:b/>
-          <w:bCs/>
-          <w:u w:val="single"/>
-        </w:rPr>
         <w:t>________________________________</w:t>
       </w:r>
     </w:p>
@@ -6002,23 +4287,21 @@
         </w:rPr>
         <w:t>users[0].</w:t>
       </w:r>
-      <w:proofErr w:type="spellStart"/>
       <w:r>
         <w:rPr>
           <w:bCs/>
           <w:sz w:val="20"/>
           <w:szCs w:val="20"/>
         </w:rPr>
-        <w:t>name_full</w:t>
-      </w:r>
-      <w:proofErr w:type="spellEnd"/>
+        <w:t>name_full()</w:t>
+      </w:r>
       <w:r>
         <w:rPr>
           <w:bCs/>
           <w:sz w:val="20"/>
           <w:szCs w:val="20"/>
         </w:rPr>
-        <w:t>()</w:t>
+        <w:t>}</w:t>
       </w:r>
       <w:r>
         <w:rPr>
@@ -6030,25 +4313,25 @@
       </w:r>
       <w:r>
         <w:rPr>
+          <w:sz w:val="20"/>
+          <w:szCs w:val="20"/>
+        </w:rPr>
+        <w:t>,</w:t>
+      </w:r>
+      <w:r>
+        <w:rPr>
+          <w:sz w:val="20"/>
+          <w:szCs w:val="20"/>
+        </w:rPr>
+        <w:t xml:space="preserve"> </w:t>
+      </w:r>
+      <w:r>
+        <w:rPr>
           <w:bCs/>
           <w:sz w:val="20"/>
           <w:szCs w:val="20"/>
         </w:rPr>
-        <w:t>}</w:t>
-      </w:r>
-      <w:r>
-        <w:rPr>
-          <w:sz w:val="20"/>
-          <w:szCs w:val="20"/>
-        </w:rPr>
-        <w:t>,</w:t>
-      </w:r>
-      <w:r>
-        <w:rPr>
-          <w:sz w:val="20"/>
-          <w:szCs w:val="20"/>
-        </w:rPr>
-        <w:t xml:space="preserve"> </w:t>
+        <w:t>{{</w:t>
       </w:r>
       <w:r>
         <w:rPr>
@@ -6056,7 +4339,7 @@
           <w:sz w:val="20"/>
           <w:szCs w:val="20"/>
         </w:rPr>
-        <w:t>{{</w:t>
+        <w:t>users[0].</w:t>
       </w:r>
       <w:r>
         <w:rPr>
@@ -6064,25 +4347,23 @@
           <w:sz w:val="20"/>
           <w:szCs w:val="20"/>
         </w:rPr>
-        <w:t>users[0].</w:t>
-      </w:r>
-      <w:proofErr w:type="spellStart"/>
+        <w:t>address.on_one_line</w:t>
+      </w:r>
       <w:r>
         <w:rPr>
           <w:bCs/>
           <w:sz w:val="20"/>
           <w:szCs w:val="20"/>
         </w:rPr>
-        <w:t>address.on_one_line</w:t>
-      </w:r>
-      <w:proofErr w:type="spellEnd"/>
+        <w:t>(</w:t>
+      </w:r>
       <w:r>
         <w:rPr>
           <w:bCs/>
           <w:sz w:val="20"/>
           <w:szCs w:val="20"/>
         </w:rPr>
-        <w:t>(</w:t>
+        <w:t>bare=True</w:t>
       </w:r>
       <w:r>
         <w:rPr>
@@ -6090,7 +4371,106 @@
           <w:sz w:val="20"/>
           <w:szCs w:val="20"/>
         </w:rPr>
-        <w:t>bare=True</w:t>
+        <w:t>)}}</w:t>
+      </w:r>
+      <w:r>
+        <w:rPr>
+          <w:sz w:val="20"/>
+          <w:szCs w:val="20"/>
+        </w:rPr>
+        <w:t xml:space="preserve">{% if </w:t>
+      </w:r>
+      <w:r>
+        <w:rPr>
+          <w:sz w:val="20"/>
+          <w:szCs w:val="20"/>
+        </w:rPr>
+        <w:t>users[0].</w:t>
+      </w:r>
+      <w:r>
+        <w:rPr>
+          <w:sz w:val="20"/>
+          <w:szCs w:val="20"/>
+        </w:rPr>
+        <w:t>include_phone == True %}, {{phone_number_formatted(</w:t>
+      </w:r>
+      <w:r>
+        <w:rPr>
+          <w:sz w:val="20"/>
+          <w:szCs w:val="20"/>
+        </w:rPr>
+        <w:t>users[0].</w:t>
+      </w:r>
+      <w:r>
+        <w:rPr>
+          <w:sz w:val="20"/>
+          <w:szCs w:val="20"/>
+        </w:rPr>
+        <w:t xml:space="preserve">phone_number)}}{% endif %}{% if </w:t>
+      </w:r>
+      <w:r>
+        <w:rPr>
+          <w:sz w:val="20"/>
+          <w:szCs w:val="20"/>
+        </w:rPr>
+        <w:t>users[0].</w:t>
+      </w:r>
+      <w:r>
+        <w:rPr>
+          <w:sz w:val="20"/>
+          <w:szCs w:val="20"/>
+        </w:rPr>
+        <w:t xml:space="preserve">include_email </w:t>
+      </w:r>
+      <w:r>
+        <w:rPr>
+          <w:sz w:val="20"/>
+          <w:szCs w:val="20"/>
+        </w:rPr>
+        <w:t xml:space="preserve">== True </w:t>
+      </w:r>
+      <w:r>
+        <w:rPr>
+          <w:sz w:val="20"/>
+          <w:szCs w:val="20"/>
+        </w:rPr>
+        <w:t>%}, {{</w:t>
+      </w:r>
+      <w:r>
+        <w:rPr>
+          <w:sz w:val="20"/>
+          <w:szCs w:val="20"/>
+        </w:rPr>
+        <w:t>users[0].</w:t>
+      </w:r>
+      <w:r>
+        <w:rPr>
+          <w:sz w:val="20"/>
+          <w:szCs w:val="20"/>
+        </w:rPr>
+        <w:t>email</w:t>
+      </w:r>
+      <w:r>
+        <w:rPr>
+          <w:sz w:val="20"/>
+          <w:szCs w:val="20"/>
+        </w:rPr>
+        <w:t>}}{% endif %}</w:t>
+      </w:r>
+    </w:p>
+    <w:p>
+      <w:pPr>
+        <w:rPr>
+          <w:sz w:val="20"/>
+          <w:szCs w:val="20"/>
+        </w:rPr>
+      </w:pPr>
+      <w:r>
+        <w:rPr>
+          <w:sz w:val="20"/>
+          <w:szCs w:val="20"/>
+        </w:rPr>
+        <w:t>{% if joint_language == True %}</w:t>
       </w:r>
       <w:r>
         <w:rPr>
@@ -6098,165 +4478,7 @@
           <w:sz w:val="20"/>
           <w:szCs w:val="20"/>
         </w:rPr>
-        <w:t>)}}</w:t>
-      </w:r>
-      <w:r>
-        <w:rPr>
-          <w:sz w:val="20"/>
-          <w:szCs w:val="20"/>
-        </w:rPr>
-        <w:t xml:space="preserve">{% if </w:t>
-      </w:r>
-      <w:r>
-        <w:rPr>
-          <w:sz w:val="20"/>
-          <w:szCs w:val="20"/>
-        </w:rPr>
-        <w:t>users[0].</w:t>
-      </w:r>
-      <w:proofErr w:type="spellStart"/>
-      <w:r>
-        <w:rPr>
-          <w:sz w:val="20"/>
-          <w:szCs w:val="20"/>
-        </w:rPr>
-        <w:t>include_phone</w:t>
-      </w:r>
-      <w:proofErr w:type="spellEnd"/>
-      <w:r>
-        <w:rPr>
-          <w:sz w:val="20"/>
-          <w:szCs w:val="20"/>
-        </w:rPr>
-        <w:t xml:space="preserve"> == True %}, {{</w:t>
-      </w:r>
-      <w:proofErr w:type="spellStart"/>
-      <w:r>
-        <w:rPr>
-          <w:sz w:val="20"/>
-          <w:szCs w:val="20"/>
-        </w:rPr>
-        <w:t>phone_number_formatted</w:t>
-      </w:r>
-      <w:proofErr w:type="spellEnd"/>
-      <w:r>
-        <w:rPr>
-          <w:sz w:val="20"/>
-          <w:szCs w:val="20"/>
-        </w:rPr>
-        <w:t>(</w:t>
-      </w:r>
-      <w:r>
-        <w:rPr>
-          <w:sz w:val="20"/>
-          <w:szCs w:val="20"/>
-        </w:rPr>
-        <w:t>users[0].</w:t>
-      </w:r>
-      <w:proofErr w:type="spellStart"/>
-      <w:r>
-        <w:rPr>
-          <w:sz w:val="20"/>
-          <w:szCs w:val="20"/>
-        </w:rPr>
-        <w:t>phone_number</w:t>
-      </w:r>
-      <w:proofErr w:type="spellEnd"/>
-      <w:r>
-        <w:rPr>
-          <w:sz w:val="20"/>
-          <w:szCs w:val="20"/>
-        </w:rPr>
-        <w:t xml:space="preserve">)}}{% endif %}{% if </w:t>
-      </w:r>
-      <w:r>
-        <w:rPr>
-          <w:sz w:val="20"/>
-          <w:szCs w:val="20"/>
-        </w:rPr>
-        <w:t>users[0].</w:t>
-      </w:r>
-      <w:proofErr w:type="spellStart"/>
-      <w:r>
-        <w:rPr>
-          <w:sz w:val="20"/>
-          <w:szCs w:val="20"/>
-        </w:rPr>
-        <w:t>include_email</w:t>
-      </w:r>
-      <w:proofErr w:type="spellEnd"/>
-      <w:r>
-        <w:rPr>
-          <w:sz w:val="20"/>
-          <w:szCs w:val="20"/>
-        </w:rPr>
-        <w:t xml:space="preserve"> </w:t>
-      </w:r>
-      <w:r>
-        <w:rPr>
-          <w:sz w:val="20"/>
-          <w:szCs w:val="20"/>
-        </w:rPr>
-        <w:t xml:space="preserve">== True </w:t>
-      </w:r>
-      <w:r>
-        <w:rPr>
-          <w:sz w:val="20"/>
-          <w:szCs w:val="20"/>
-        </w:rPr>
-        <w:t>%}, {{</w:t>
-      </w:r>
-      <w:r>
-        <w:rPr>
-          <w:sz w:val="20"/>
-          <w:szCs w:val="20"/>
-        </w:rPr>
-        <w:t>users[0].</w:t>
-      </w:r>
-      <w:r>
-        <w:rPr>
-          <w:sz w:val="20"/>
-          <w:szCs w:val="20"/>
-        </w:rPr>
-        <w:t>email</w:t>
-      </w:r>
-      <w:r>
-        <w:rPr>
-          <w:sz w:val="20"/>
-          <w:szCs w:val="20"/>
-        </w:rPr>
-        <w:t>}}{% endif %}</w:t>
-      </w:r>
-    </w:p>
-    <w:p>
-      <w:pPr>
-        <w:rPr>
-          <w:sz w:val="20"/>
-          <w:szCs w:val="20"/>
-        </w:rPr>
-      </w:pPr>
-      <w:r>
-        <w:rPr>
-          <w:sz w:val="20"/>
-          <w:szCs w:val="20"/>
-        </w:rPr>
-        <w:t xml:space="preserve">{% if </w:t>
-      </w:r>
-      <w:proofErr w:type="spellStart"/>
-      <w:r>
-        <w:rPr>
-          <w:sz w:val="20"/>
-          <w:szCs w:val="20"/>
-        </w:rPr>
-        <w:t>joint_language</w:t>
-      </w:r>
-      <w:proofErr w:type="spellEnd"/>
-      <w:r>
-        <w:rPr>
-          <w:sz w:val="20"/>
-          <w:szCs w:val="20"/>
-        </w:rPr>
-        <w:t xml:space="preserve"> == True %}</w:t>
+        <w:t>{{</w:t>
       </w:r>
       <w:r>
         <w:rPr>
@@ -6264,16 +4486,15 @@
           <w:sz w:val="20"/>
           <w:szCs w:val="20"/>
         </w:rPr>
-        <w:t>{{</w:t>
-      </w:r>
-      <w:proofErr w:type="spellStart"/>
+        <w:t>joint_owner</w:t>
+      </w:r>
       <w:r>
         <w:rPr>
           <w:bCs/>
           <w:sz w:val="20"/>
           <w:szCs w:val="20"/>
         </w:rPr>
-        <w:t>joint_owner</w:t>
+        <w:t>.</w:t>
       </w:r>
       <w:r>
         <w:rPr>
@@ -6281,7 +4502,7 @@
           <w:sz w:val="20"/>
           <w:szCs w:val="20"/>
         </w:rPr>
-        <w:t>.</w:t>
+        <w:t>name_full()</w:t>
       </w:r>
       <w:r>
         <w:rPr>
@@ -6289,16 +4510,22 @@
           <w:sz w:val="20"/>
           <w:szCs w:val="20"/>
         </w:rPr>
-        <w:t>name_full</w:t>
-      </w:r>
-      <w:proofErr w:type="spellEnd"/>
+        <w:t>}}</w:t>
+      </w:r>
       <w:r>
         <w:rPr>
           <w:bCs/>
           <w:sz w:val="20"/>
           <w:szCs w:val="20"/>
         </w:rPr>
-        <w:t>()</w:t>
+        <w:t>,</w:t>
+      </w:r>
+      <w:r>
+        <w:rPr>
+          <w:sz w:val="20"/>
+          <w:szCs w:val="20"/>
+        </w:rPr>
+        <w:t xml:space="preserve"> </w:t>
       </w:r>
       <w:r>
         <w:rPr>
@@ -6306,7 +4533,7 @@
           <w:sz w:val="20"/>
           <w:szCs w:val="20"/>
         </w:rPr>
-        <w:t>}}</w:t>
+        <w:t>{{</w:t>
       </w:r>
       <w:r>
         <w:rPr>
@@ -6314,14 +4541,7 @@
           <w:sz w:val="20"/>
           <w:szCs w:val="20"/>
         </w:rPr>
-        <w:t>,</w:t>
-      </w:r>
-      <w:r>
-        <w:rPr>
-          <w:sz w:val="20"/>
-          <w:szCs w:val="20"/>
-        </w:rPr>
-        <w:t xml:space="preserve"> </w:t>
+        <w:t>joint_owner</w:t>
       </w:r>
       <w:r>
         <w:rPr>
@@ -6329,148 +4549,70 @@
           <w:sz w:val="20"/>
           <w:szCs w:val="20"/>
         </w:rPr>
-        <w:t>{{</w:t>
-      </w:r>
-      <w:proofErr w:type="spellStart"/>
-      <w:r>
-        <w:rPr>
-          <w:bCs/>
+        <w:t>.address.on_one_line(bare=True)}}</w:t>
+      </w:r>
+      <w:r>
+        <w:rPr>
           <w:sz w:val="20"/>
           <w:szCs w:val="20"/>
         </w:rPr>
-        <w:t>joint_owner</w:t>
-      </w:r>
-      <w:r>
-        <w:rPr>
-          <w:bCs/>
+        <w:t xml:space="preserve">{% if </w:t>
+      </w:r>
+      <w:r>
+        <w:rPr>
           <w:sz w:val="20"/>
           <w:szCs w:val="20"/>
         </w:rPr>
-        <w:t>.address.on_one_line</w:t>
-      </w:r>
-      <w:proofErr w:type="spellEnd"/>
-      <w:r>
-        <w:rPr>
-          <w:bCs/>
+        <w:t>joint_owner</w:t>
+      </w:r>
+      <w:r>
+        <w:rPr>
           <w:sz w:val="20"/>
           <w:szCs w:val="20"/>
         </w:rPr>
-        <w:t>(bare=True)}}</w:t>
+        <w:t>.include_phone == True %}, {{phone_number_formatted(</w:t>
       </w:r>
       <w:r>
         <w:rPr>
           <w:sz w:val="20"/>
           <w:szCs w:val="20"/>
         </w:rPr>
-        <w:t xml:space="preserve">{% if </w:t>
-      </w:r>
-      <w:proofErr w:type="spellStart"/>
+        <w:t>joint_owner</w:t>
+      </w:r>
       <w:r>
         <w:rPr>
           <w:sz w:val="20"/>
           <w:szCs w:val="20"/>
         </w:rPr>
-        <w:t>joint_owner</w:t>
+        <w:t xml:space="preserve">.phone_number)}}{% endif %}{% if </w:t>
       </w:r>
       <w:r>
         <w:rPr>
           <w:sz w:val="20"/>
           <w:szCs w:val="20"/>
         </w:rPr>
-        <w:t>.include_phone</w:t>
-      </w:r>
-      <w:proofErr w:type="spellEnd"/>
+        <w:t>joint_owner</w:t>
+      </w:r>
       <w:r>
         <w:rPr>
           <w:sz w:val="20"/>
           <w:szCs w:val="20"/>
         </w:rPr>
-        <w:t xml:space="preserve"> == True %}, {{</w:t>
-      </w:r>
-      <w:proofErr w:type="spellStart"/>
+        <w:t>.include_email == True %}, {{</w:t>
+      </w:r>
       <w:r>
         <w:rPr>
           <w:sz w:val="20"/>
           <w:szCs w:val="20"/>
         </w:rPr>
-        <w:t>phone_number_formatted</w:t>
-      </w:r>
-      <w:proofErr w:type="spellEnd"/>
+        <w:t>joint_owner</w:t>
+      </w:r>
       <w:r>
         <w:rPr>
           <w:sz w:val="20"/>
           <w:szCs w:val="20"/>
         </w:rPr>
-        <w:t>(</w:t>
-      </w:r>
-      <w:proofErr w:type="spellStart"/>
-      <w:r>
-        <w:rPr>
-          <w:sz w:val="20"/>
-          <w:szCs w:val="20"/>
-        </w:rPr>
-        <w:t>joint_owner</w:t>
-      </w:r>
-      <w:r>
-        <w:rPr>
-          <w:sz w:val="20"/>
-          <w:szCs w:val="20"/>
-        </w:rPr>
-        <w:t>.phone_number</w:t>
-      </w:r>
-      <w:proofErr w:type="spellEnd"/>
-      <w:r>
-        <w:rPr>
-          <w:sz w:val="20"/>
-          <w:szCs w:val="20"/>
-        </w:rPr>
-        <w:t xml:space="preserve">)}}{% endif %}{% if </w:t>
-      </w:r>
-      <w:proofErr w:type="spellStart"/>
-      <w:r>
-        <w:rPr>
-          <w:sz w:val="20"/>
-          <w:szCs w:val="20"/>
-        </w:rPr>
-        <w:t>joint_owner</w:t>
-      </w:r>
-      <w:r>
-        <w:rPr>
-          <w:sz w:val="20"/>
-          <w:szCs w:val="20"/>
-        </w:rPr>
-        <w:t>.include_email</w:t>
-      </w:r>
-      <w:proofErr w:type="spellEnd"/>
-      <w:r>
-        <w:rPr>
-          <w:sz w:val="20"/>
-          <w:szCs w:val="20"/>
-        </w:rPr>
-        <w:t xml:space="preserve"> == True %}, {{</w:t>
-      </w:r>
-      <w:proofErr w:type="spellStart"/>
-      <w:r>
-        <w:rPr>
-          <w:sz w:val="20"/>
-          <w:szCs w:val="20"/>
-        </w:rPr>
-        <w:t>joint_owner</w:t>
-      </w:r>
-      <w:r>
-        <w:rPr>
-          <w:sz w:val="20"/>
-          <w:szCs w:val="20"/>
-        </w:rPr>
-        <w:t>.email</w:t>
-      </w:r>
-      <w:proofErr w:type="spellEnd"/>
-      <w:r>
-        <w:rPr>
-          <w:sz w:val="20"/>
-          <w:szCs w:val="20"/>
-        </w:rPr>
-        <w:t>}}{% endif %}{% endif %}</w:t>
+        <w:t>.email}}{% endif %}{% endif %}</w:t>
       </w:r>
     </w:p>
     <w:p>
@@ -7049,45 +5191,29 @@
         </w:rPr>
         <w:t>users[0].</w:t>
       </w:r>
-      <w:proofErr w:type="spellStart"/>
       <w:r>
         <w:rPr>
           <w:bCs/>
         </w:rPr>
-        <w:t>name_full</w:t>
-      </w:r>
-      <w:proofErr w:type="spellEnd"/>
+        <w:t>name_full()</w:t>
+      </w:r>
       <w:r>
         <w:rPr>
           <w:bCs/>
         </w:rPr>
-        <w:t>()</w:t>
+        <w:t>}} ({{</w:t>
       </w:r>
       <w:r>
         <w:rPr>
           <w:bCs/>
         </w:rPr>
-        <w:t>}} ({{</w:t>
+        <w:t>users[0].</w:t>
       </w:r>
       <w:r>
         <w:rPr>
           <w:bCs/>
         </w:rPr>
-        <w:t>users[0].</w:t>
-      </w:r>
-      <w:proofErr w:type="spellStart"/>
-      <w:r>
-        <w:rPr>
-          <w:bCs/>
-        </w:rPr>
-        <w:t>marital_status</w:t>
-      </w:r>
-      <w:proofErr w:type="spellEnd"/>
-      <w:r>
-        <w:rPr>
-          <w:bCs/>
-        </w:rPr>
-        <w:t>}}</w:t>
+        <w:t>marital_status}}</w:t>
       </w:r>
       <w:r>
         <w:rPr>
@@ -7112,17 +5238,8 @@
         <w:t>,</w:t>
       </w:r>
       <w:r>
-        <w:t xml:space="preserve">{% if </w:t>
-      </w:r>
-      <w:proofErr w:type="spellStart"/>
-      <w:r>
-        <w:t>joint_language</w:t>
-      </w:r>
-      <w:proofErr w:type="spellEnd"/>
-      <w:r>
-        <w:t xml:space="preserve"> == True %} and {{</w:t>
-      </w:r>
-      <w:proofErr w:type="spellStart"/>
+        <w:t>{% if joint_language == True %} and {{</w:t>
+      </w:r>
       <w:r>
         <w:t>joint_owner</w:t>
       </w:r>
@@ -7130,11 +5247,7 @@
         <w:t>.</w:t>
       </w:r>
       <w:r>
-        <w:t>name_full</w:t>
-      </w:r>
-      <w:proofErr w:type="spellEnd"/>
-      <w:r>
-        <w:t>()</w:t>
+        <w:t>name_full()</w:t>
       </w:r>
       <w:r>
         <w:t>}</w:t>
@@ -7148,14 +5261,12 @@
       <w:r>
         <w:t>({{</w:t>
       </w:r>
-      <w:proofErr w:type="spellStart"/>
       <w:r>
         <w:t>joint_owner</w:t>
       </w:r>
       <w:r>
         <w:t>.marital_status</w:t>
       </w:r>
-      <w:proofErr w:type="spellEnd"/>
       <w:r>
         <w:rPr>
           <w:bCs/>
@@ -7188,15 +5299,7 @@
         <w:t xml:space="preserve"> owning</w:t>
       </w:r>
       <w:r>
-        <w:t xml:space="preserve">{% if </w:t>
-      </w:r>
-      <w:proofErr w:type="spellStart"/>
-      <w:r>
-        <w:t>other_owners_check</w:t>
-      </w:r>
-      <w:proofErr w:type="spellEnd"/>
-      <w:r>
-        <w:t xml:space="preserve"> != “sole</w:t>
+        <w:t>{% if other_owners_check != “sole</w:t>
       </w:r>
       <w:r>
         <w:t>”</w:t>
@@ -7204,11 +5307,9 @@
       <w:r>
         <w:t xml:space="preserve"> %}{% if </w:t>
       </w:r>
-      <w:proofErr w:type="spellStart"/>
       <w:r>
         <w:t>shared_owners_type</w:t>
       </w:r>
-      <w:proofErr w:type="spellEnd"/>
       <w:r>
         <w:t xml:space="preserve"> == “</w:t>
       </w:r>
@@ -7221,11 +5322,9 @@
       <w:r>
         <w:t>{{</w:t>
       </w:r>
-      <w:proofErr w:type="spellStart"/>
       <w:r>
         <w:t>user_common_share</w:t>
       </w:r>
-      <w:proofErr w:type="spellEnd"/>
       <w:r>
         <w:t>}}</w:t>
       </w:r>
@@ -7252,20 +5351,7 @@
     </w:p>
     <w:p>
       <w:r>
-        <w:t>{{</w:t>
-      </w:r>
-      <w:proofErr w:type="spellStart"/>
-      <w:r>
-        <w:t>todi_</w:t>
-      </w:r>
-      <w:proofErr w:type="gramStart"/>
-      <w:r>
-        <w:t>property.description</w:t>
-      </w:r>
-      <w:proofErr w:type="spellEnd"/>
-      <w:proofErr w:type="gramEnd"/>
-      <w:r>
-        <w:t>}}</w:t>
+        <w:t>{{todi_property.description}}</w:t>
       </w:r>
     </w:p>
     <w:p/>
@@ -7274,44 +5360,20 @@
         <w:t xml:space="preserve">That the street address of the real estate is </w:t>
       </w:r>
       <w:r>
-        <w:t>{{</w:t>
-      </w:r>
-      <w:proofErr w:type="spellStart"/>
-      <w:r>
-        <w:t>todi_</w:t>
-      </w:r>
-      <w:proofErr w:type="gramStart"/>
-      <w:r>
-        <w:t>property</w:t>
-      </w:r>
-      <w:r>
-        <w:t>.on</w:t>
-      </w:r>
-      <w:proofErr w:type="gramEnd"/>
-      <w:r>
-        <w:t>_one_line</w:t>
-      </w:r>
-      <w:proofErr w:type="spellEnd"/>
-      <w:r>
-        <w:t>(</w:t>
+        <w:t>{{todi_property</w:t>
+      </w:r>
+      <w:r>
+        <w:t>.on_one_line(</w:t>
       </w:r>
       <w:r>
         <w:rPr>
           <w:bCs/>
         </w:rPr>
-        <w:t>bare=</w:t>
-      </w:r>
-      <w:proofErr w:type="gramStart"/>
-      <w:r>
-        <w:rPr>
-          <w:bCs/>
-        </w:rPr>
-        <w:t>True</w:t>
+        <w:t>bare=True</w:t>
       </w:r>
       <w:r>
         <w:t>)}}</w:t>
       </w:r>
-      <w:proofErr w:type="gramEnd"/>
       <w:r>
         <w:t xml:space="preserve"> and the property i</w:t>
       </w:r>
@@ -7322,15 +5384,7 @@
         <w:t xml:space="preserve"> number is </w:t>
       </w:r>
       <w:r>
-        <w:t>{{</w:t>
-      </w:r>
-      <w:proofErr w:type="spellStart"/>
-      <w:r>
-        <w:t>todi_property.pin</w:t>
-      </w:r>
-      <w:proofErr w:type="spellEnd"/>
-      <w:r>
-        <w:t>}}</w:t>
+        <w:t>{{todi_property.pin}}</w:t>
       </w:r>
       <w:r>
         <w:t>.</w:t>
@@ -7451,27 +5505,15 @@
             <w:r>
               <w:t>{{</w:t>
             </w:r>
-            <w:proofErr w:type="spellStart"/>
-            <w:r>
-              <w:t>end_in_county</w:t>
-            </w:r>
-            <w:proofErr w:type="spellEnd"/>
-            <w:r>
-              <w:t>(</w:t>
-            </w:r>
-            <w:proofErr w:type="spellStart"/>
-            <w:r>
-              <w:t>todi_</w:t>
-            </w:r>
-            <w:proofErr w:type="gramStart"/>
-            <w:r>
-              <w:t>property.</w:t>
+            <w:r>
+              <w:t>end_in_county(</w:t>
+            </w:r>
+            <w:r>
+              <w:t>todi_property.</w:t>
             </w:r>
             <w:r>
               <w:t>county</w:t>
             </w:r>
-            <w:proofErr w:type="spellEnd"/>
-            <w:proofErr w:type="gramEnd"/>
             <w:r>
               <w:t>)</w:t>
             </w:r>
@@ -7528,23 +5570,7 @@
                 <w:b/>
                 <w:spacing w:val="-4"/>
               </w:rPr>
-              <w:t xml:space="preserve">Beneficiary </w:t>
-            </w:r>
-            <w:proofErr w:type="gramStart"/>
-            <w:r>
-              <w:rPr>
-                <w:b/>
-                <w:spacing w:val="-4"/>
-              </w:rPr>
-              <w:t>Name,  Relationship</w:t>
-            </w:r>
-            <w:proofErr w:type="gramEnd"/>
-            <w:r>
-              <w:rPr>
-                <w:b/>
-                <w:spacing w:val="-4"/>
-              </w:rPr>
-              <w:t xml:space="preserve"> to Owner</w:t>
+              <w:t>Beneficiary Name,  Relationship to Owner</w:t>
             </w:r>
           </w:p>
         </w:tc>
@@ -7594,13 +5620,8 @@
     </w:tbl>
     <w:p>
       <w:r>
-        <w:t xml:space="preserve">{% for person in </w:t>
-      </w:r>
-      <w:proofErr w:type="gramStart"/>
-      <w:r>
-        <w:t>beneficiaries %}</w:t>
-      </w:r>
-      <w:proofErr w:type="gramEnd"/>
+        <w:t>{% for person in beneficiaries %}</w:t>
+      </w:r>
     </w:p>
     <w:tbl>
       <w:tblPr>
@@ -7723,55 +5744,26 @@
     </w:tbl>
     <w:p>
       <w:r>
-        <w:t xml:space="preserve">{% </w:t>
-      </w:r>
-      <w:proofErr w:type="spellStart"/>
-      <w:r>
-        <w:t>endfor</w:t>
-      </w:r>
-      <w:proofErr w:type="spellEnd"/>
-      <w:r>
-        <w:t xml:space="preserve"> %}</w:t>
+        <w:t>{% endfor %}</w:t>
       </w:r>
       <w:r>
         <w:br w:type="page"/>
       </w:r>
       <w:r>
         <w:lastRenderedPageBreak/>
-        <w:t>In witness whereof, the undersigned beneficiaries hereby accept the transfer of real estate under the transfer on death instrument this _______ day of ___________, _____</w:t>
-      </w:r>
-      <w:proofErr w:type="gramStart"/>
-      <w:r>
-        <w:t>_.</w:t>
-      </w:r>
-      <w:r>
-        <w:t>{</w:t>
-      </w:r>
-      <w:proofErr w:type="gramEnd"/>
-      <w:r>
-        <w:t xml:space="preserve">% for person in beneficiaries </w:t>
-      </w:r>
-      <w:proofErr w:type="gramStart"/>
-      <w:r>
-        <w:t>%}</w:t>
-      </w:r>
-      <w:r>
-        <w:t>{</w:t>
-      </w:r>
-      <w:proofErr w:type="gramEnd"/>
-      <w:r>
-        <w:t xml:space="preserve">% if </w:t>
+        <w:t>In witness whereof, the undersigned beneficiaries hereby accept the transfer of real estate under the transfer on death instrument this _______ day of ___________, ______.</w:t>
+      </w:r>
+      <w:r>
+        <w:t>{% for person in beneficiaries %}</w:t>
+      </w:r>
+      <w:r>
+        <w:t xml:space="preserve">{% if </w:t>
       </w:r>
       <w:r>
         <w:t>(</w:t>
       </w:r>
-      <w:proofErr w:type="gramStart"/>
-      <w:r>
-        <w:t>loop.index</w:t>
-      </w:r>
-      <w:proofErr w:type="gramEnd"/>
-      <w:r>
-        <w:t>0</w:t>
+      <w:r>
+        <w:t>loop.index0</w:t>
       </w:r>
       <w:r>
         <w:t xml:space="preserve"> % 2</w:t>
@@ -7958,26 +5950,8 @@
     </w:tbl>
     <w:p>
       <w:r>
-        <w:t xml:space="preserve">{% endif </w:t>
-      </w:r>
-      <w:proofErr w:type="gramStart"/>
-      <w:r>
-        <w:t>%}{</w:t>
-      </w:r>
-      <w:proofErr w:type="gramEnd"/>
-      <w:r>
-        <w:t xml:space="preserve">% </w:t>
-      </w:r>
-      <w:proofErr w:type="spellStart"/>
-      <w:proofErr w:type="gramStart"/>
-      <w:r>
-        <w:t>endfor</w:t>
-      </w:r>
-      <w:proofErr w:type="spellEnd"/>
-      <w:r>
-        <w:t xml:space="preserve"> %}</w:t>
-      </w:r>
-      <w:proofErr w:type="gramEnd"/>
+        <w:t>{% endif %}{% endfor %}</w:t>
+      </w:r>
     </w:p>
     <w:p>
       <w:r>
@@ -8014,7 +5988,13 @@
         <w:t xml:space="preserve"> </w:t>
       </w:r>
       <w:r>
-        <w:t xml:space="preserve"> personally known to me to be the same person or persons whose name or names are subscribed to the foregoing instrument, appeared before me this day in person and swore on oath to the above foregoing affidavit. Signed and sworn to before me this ____ day of _________________, _______.</w:t>
+        <w:t xml:space="preserve"> personally known to me to be the same person or persons whose name or names are subscribed to the foregoing instrument,</w:t>
+      </w:r>
+      <w:r>
+        <w:t xml:space="preserve"> </w:t>
+      </w:r>
+      <w:r>
+        <w:t>appeared before me this day in person and swore on oath to the above foregoing affidavit. Signed and sworn to before me this ____ day of _________________, _______.</w:t>
       </w:r>
     </w:p>
     <w:p/>

</xml_diff>